<commit_message>
Add likely Prof. Liang questions beyond the price opening.
Note that prior visit reports are not in the vault. Cover switch from Pegasys, HIDAT, splenomegaly, HA/PSP 2026, self-injection, pregnancy, and ET/MF close-outs with two-sentence answers.

Co-authored-by: jackiechow4567-arch <jackiechow4567-arch@users.noreply.github.com>
</commit_message>
<xml_diff>
--- a/industry/pm-reference/hcp-meeting-script-liang-20260826-yue.docx
+++ b/industry/pm-reference/hcp-meeting-script-liang-20260826-yue.docx
@@ -5,7 +5,6 @@
     <w:p>
       <w:pPr>
         <w:pStyle w:val="Heading1"/>
-        <w:spacing w:after="120" w:line="276" w:lineRule="auto"/>
       </w:pPr>
       <w:r>
         <w:rPr>
@@ -28,9 +27,6 @@
       </w:r>
     </w:p>
     <w:p>
-      <w:pPr>
-        <w:spacing w:after="120" w:line="276" w:lineRule="auto"/>
-      </w:pPr>
       <w:r>
         <w:rPr>
           <w:rFonts w:ascii="Calibri" w:hAnsi="Calibri" w:eastAsia="Microsoft JhengHei"/>
@@ -237,7 +233,6 @@
     <w:p>
       <w:pPr>
         <w:pStyle w:val="Heading2"/>
-        <w:spacing w:after="120" w:line="276" w:lineRule="auto"/>
       </w:pPr>
       <w:r>
         <w:rPr>
@@ -254,9 +249,6 @@
       </w:r>
     </w:p>
     <w:p>
-      <w:pPr>
-        <w:spacing w:after="120" w:line="276" w:lineRule="auto"/>
-      </w:pPr>
       <w:r>
         <w:rPr>
           <w:rFonts w:ascii="Calibri" w:hAnsi="Calibri" w:eastAsia="Microsoft JhengHei"/>
@@ -338,9 +330,6 @@
       </w:r>
     </w:p>
     <w:p>
-      <w:pPr>
-        <w:spacing w:after="120" w:line="276" w:lineRule="auto"/>
-      </w:pPr>
       <w:r>
         <w:rPr>
           <w:rFonts w:ascii="Calibri" w:hAnsi="Calibri" w:eastAsia="Microsoft JhengHei"/>
@@ -451,7 +440,6 @@
         <w:pBdr>
           <w:bottom w:val="single" w:sz="6" w:space="1" w:color="auto"/>
         </w:pBdr>
-        <w:spacing w:after="120" w:line="276" w:lineRule="auto"/>
       </w:pPr>
       <w:r>
         <w:rPr>
@@ -463,7 +451,6 @@
     <w:p>
       <w:pPr>
         <w:pStyle w:val="Heading2"/>
-        <w:spacing w:after="120" w:line="276" w:lineRule="auto"/>
       </w:pPr>
       <w:r>
         <w:rPr>
@@ -1050,9 +1037,6 @@
       </w:tr>
     </w:tbl>
     <w:p>
-      <w:pPr>
-        <w:spacing w:after="120" w:line="276" w:lineRule="auto"/>
-      </w:pPr>
       <w:r>
         <w:rPr>
           <w:rFonts w:ascii="Calibri" w:hAnsi="Calibri" w:eastAsia="Microsoft JhengHei"/>
@@ -1061,9 +1045,6 @@
       </w:r>
     </w:p>
     <w:p>
-      <w:pPr>
-        <w:spacing w:after="120" w:line="276" w:lineRule="auto"/>
-      </w:pPr>
       <w:r>
         <w:rPr>
           <w:rFonts w:ascii="Calibri" w:hAnsi="Calibri" w:eastAsia="Microsoft JhengHei"/>
@@ -1112,7 +1093,6 @@
         <w:pBdr>
           <w:bottom w:val="single" w:sz="6" w:space="1" w:color="auto"/>
         </w:pBdr>
-        <w:spacing w:after="120" w:line="276" w:lineRule="auto"/>
       </w:pPr>
       <w:r>
         <w:rPr>
@@ -1124,7 +1104,6 @@
     <w:p>
       <w:pPr>
         <w:pStyle w:val="Heading2"/>
-        <w:spacing w:after="120" w:line="276" w:lineRule="auto"/>
       </w:pPr>
       <w:r>
         <w:rPr>
@@ -1149,7 +1128,7 @@
     <w:p>
       <w:pPr>
         <w:pStyle w:val="ListBullet"/>
-        <w:spacing w:line="276" w:lineRule="auto" w:after="120"/>
+        <w:spacing w:line="240" w:lineRule="auto"/>
         <w:ind w:left="720"/>
       </w:pPr>
       <w:r>
@@ -1190,7 +1169,7 @@
     <w:p>
       <w:pPr>
         <w:pStyle w:val="ListBullet"/>
-        <w:spacing w:line="276" w:lineRule="auto" w:after="120"/>
+        <w:spacing w:line="240" w:lineRule="auto"/>
         <w:ind w:left="720"/>
       </w:pPr>
       <w:r>
@@ -1216,7 +1195,7 @@
     <w:p>
       <w:pPr>
         <w:pStyle w:val="ListBullet"/>
-        <w:spacing w:line="276" w:lineRule="auto" w:after="120"/>
+        <w:spacing w:line="240" w:lineRule="auto"/>
         <w:ind w:left="720"/>
       </w:pPr>
       <w:r>
@@ -1242,7 +1221,7 @@
     <w:p>
       <w:pPr>
         <w:pStyle w:val="ListBullet"/>
-        <w:spacing w:line="276" w:lineRule="auto" w:after="120"/>
+        <w:spacing w:line="240" w:lineRule="auto"/>
         <w:ind w:left="720"/>
       </w:pPr>
       <w:r>
@@ -1268,7 +1247,7 @@
     <w:p>
       <w:pPr>
         <w:pStyle w:val="ListBullet"/>
-        <w:spacing w:line="276" w:lineRule="auto" w:after="120"/>
+        <w:spacing w:line="240" w:lineRule="auto"/>
         <w:ind w:left="720"/>
       </w:pPr>
       <w:r>
@@ -1294,7 +1273,7 @@
     <w:p>
       <w:pPr>
         <w:pStyle w:val="ListBullet"/>
-        <w:spacing w:line="276" w:lineRule="auto" w:after="120"/>
+        <w:spacing w:line="240" w:lineRule="auto"/>
         <w:ind w:left="720"/>
       </w:pPr>
       <w:r>
@@ -1328,7 +1307,6 @@
         <w:pBdr>
           <w:bottom w:val="single" w:sz="6" w:space="1" w:color="auto"/>
         </w:pBdr>
-        <w:spacing w:after="120" w:line="276" w:lineRule="auto"/>
       </w:pPr>
       <w:r>
         <w:rPr>
@@ -1340,7 +1318,6 @@
     <w:p>
       <w:pPr>
         <w:pStyle w:val="Heading2"/>
-        <w:spacing w:after="120" w:line="276" w:lineRule="auto"/>
       </w:pPr>
       <w:r>
         <w:rPr>
@@ -1357,9 +1334,6 @@
       </w:r>
     </w:p>
     <w:p>
-      <w:pPr>
-        <w:spacing w:after="120" w:line="276" w:lineRule="auto"/>
-      </w:pPr>
       <w:r>
         <w:rPr>
           <w:rFonts w:ascii="Calibri" w:hAnsi="Calibri" w:eastAsia="Microsoft JhengHei"/>
@@ -1689,9 +1663,6 @@
       </w:tr>
     </w:tbl>
     <w:p>
-      <w:pPr>
-        <w:spacing w:after="120" w:line="276" w:lineRule="auto"/>
-      </w:pPr>
       <w:r>
         <w:rPr>
           <w:rFonts w:ascii="Calibri" w:hAnsi="Calibri" w:eastAsia="Microsoft JhengHei"/>
@@ -1700,9 +1671,6 @@
       </w:r>
     </w:p>
     <w:p>
-      <w:pPr>
-        <w:spacing w:after="120" w:line="276" w:lineRule="auto"/>
-      </w:pPr>
       <w:r>
         <w:rPr>
           <w:rFonts w:ascii="Calibri" w:hAnsi="Calibri" w:eastAsia="Microsoft JhengHei"/>
@@ -1733,7 +1701,7 @@
     <w:p>
       <w:pPr>
         <w:pStyle w:val="ListNumber"/>
-        <w:spacing w:line="276" w:lineRule="auto" w:after="120"/>
+        <w:spacing w:line="240" w:lineRule="auto"/>
         <w:ind w:left="720"/>
       </w:pPr>
       <w:r>
@@ -1767,7 +1735,7 @@
     <w:p>
       <w:pPr>
         <w:pStyle w:val="ListNumber"/>
-        <w:spacing w:line="276" w:lineRule="auto" w:after="120"/>
+        <w:spacing w:line="240" w:lineRule="auto"/>
         <w:ind w:left="720"/>
       </w:pPr>
       <w:r>
@@ -1816,7 +1784,7 @@
     <w:p>
       <w:pPr>
         <w:pStyle w:val="ListNumber"/>
-        <w:spacing w:line="276" w:lineRule="auto" w:after="120"/>
+        <w:spacing w:line="240" w:lineRule="auto"/>
         <w:ind w:left="720"/>
       </w:pPr>
       <w:r>
@@ -1871,7 +1839,6 @@
     <w:p>
       <w:pPr>
         <w:pStyle w:val="Heading3"/>
-        <w:spacing w:after="120" w:line="276" w:lineRule="auto"/>
       </w:pPr>
       <w:r>
         <w:rPr>
@@ -1888,9 +1855,6 @@
       </w:r>
     </w:p>
     <w:p>
-      <w:pPr>
-        <w:spacing w:after="120" w:line="276" w:lineRule="auto"/>
-      </w:pPr>
       <w:r>
         <w:rPr>
           <w:rFonts w:ascii="Calibri" w:hAnsi="Calibri" w:eastAsia="Microsoft JhengHei"/>
@@ -1957,9 +1921,6 @@
       </w:r>
     </w:p>
     <w:p>
-      <w:pPr>
-        <w:spacing w:after="120" w:line="276" w:lineRule="auto"/>
-      </w:pPr>
       <w:r>
         <w:rPr>
           <w:rFonts w:ascii="Calibri" w:hAnsi="Calibri" w:eastAsia="Microsoft JhengHei"/>
@@ -2041,9 +2002,6 @@
       </w:r>
     </w:p>
     <w:p>
-      <w:pPr>
-        <w:spacing w:after="120" w:line="276" w:lineRule="auto"/>
-      </w:pPr>
       <w:r>
         <w:rPr>
           <w:rFonts w:ascii="Calibri" w:hAnsi="Calibri" w:eastAsia="Microsoft JhengHei"/>
@@ -2095,9 +2053,6 @@
       </w:r>
     </w:p>
     <w:p>
-      <w:pPr>
-        <w:spacing w:after="120" w:line="276" w:lineRule="auto"/>
-      </w:pPr>
       <w:r>
         <w:rPr>
           <w:rFonts w:ascii="Calibri" w:hAnsi="Calibri" w:eastAsia="Microsoft JhengHei"/>
@@ -2149,9 +2104,6 @@
       </w:r>
     </w:p>
     <w:p>
-      <w:pPr>
-        <w:spacing w:after="120" w:line="276" w:lineRule="auto"/>
-      </w:pPr>
       <w:r>
         <w:rPr>
           <w:rFonts w:ascii="Calibri" w:hAnsi="Calibri" w:eastAsia="Microsoft JhengHei"/>
@@ -2174,9 +2126,6 @@
       </w:r>
     </w:p>
     <w:p>
-      <w:pPr>
-        <w:spacing w:after="120" w:line="276" w:lineRule="auto"/>
-      </w:pPr>
       <w:r>
         <w:rPr>
           <w:rFonts w:ascii="Calibri" w:hAnsi="Calibri" w:eastAsia="Microsoft JhengHei"/>
@@ -2243,9 +2192,6 @@
       </w:r>
     </w:p>
     <w:p>
-      <w:pPr>
-        <w:spacing w:after="120" w:line="276" w:lineRule="auto"/>
-      </w:pPr>
       <w:r>
         <w:rPr>
           <w:rFonts w:ascii="Calibri" w:hAnsi="Calibri" w:eastAsia="Microsoft JhengHei"/>
@@ -2268,9 +2214,6 @@
       </w:r>
     </w:p>
     <w:p>
-      <w:pPr>
-        <w:spacing w:after="120" w:line="276" w:lineRule="auto"/>
-      </w:pPr>
       <w:r>
         <w:rPr>
           <w:rFonts w:ascii="Calibri" w:hAnsi="Calibri" w:eastAsia="Microsoft JhengHei"/>
@@ -2322,9 +2265,6 @@
       </w:r>
     </w:p>
     <w:p>
-      <w:pPr>
-        <w:spacing w:after="120" w:line="276" w:lineRule="auto"/>
-      </w:pPr>
       <w:r>
         <w:rPr>
           <w:rFonts w:ascii="Calibri" w:hAnsi="Calibri" w:eastAsia="Microsoft JhengHei"/>
@@ -2358,7 +2298,6 @@
         <w:pBdr>
           <w:bottom w:val="single" w:sz="6" w:space="1" w:color="auto"/>
         </w:pBdr>
-        <w:spacing w:after="120" w:line="276" w:lineRule="auto"/>
       </w:pPr>
       <w:r>
         <w:rPr>
@@ -2370,7 +2309,6 @@
     <w:p>
       <w:pPr>
         <w:pStyle w:val="Heading2"/>
-        <w:spacing w:after="120" w:line="276" w:lineRule="auto"/>
       </w:pPr>
       <w:r>
         <w:rPr>
@@ -2387,9 +2325,6 @@
       </w:r>
     </w:p>
     <w:p>
-      <w:pPr>
-        <w:spacing w:after="120" w:line="276" w:lineRule="auto"/>
-      </w:pPr>
       <w:r>
         <w:rPr>
           <w:rFonts w:ascii="Calibri" w:hAnsi="Calibri" w:eastAsia="Microsoft JhengHei"/>
@@ -2411,9 +2346,6 @@
       </w:r>
     </w:p>
     <w:p>
-      <w:pPr>
-        <w:spacing w:after="120" w:line="276" w:lineRule="auto"/>
-      </w:pPr>
       <w:r>
         <w:rPr>
           <w:rFonts w:ascii="Calibri" w:hAnsi="Calibri" w:eastAsia="Microsoft JhengHei"/>
@@ -2495,9 +2427,6 @@
       </w:r>
     </w:p>
     <w:p>
-      <w:pPr>
-        <w:spacing w:after="120" w:line="276" w:lineRule="auto"/>
-      </w:pPr>
       <w:r>
         <w:rPr>
           <w:rFonts w:ascii="Calibri" w:hAnsi="Calibri" w:eastAsia="Microsoft JhengHei"/>
@@ -2534,9 +2463,6 @@
       </w:r>
     </w:p>
     <w:p>
-      <w:pPr>
-        <w:spacing w:after="120" w:line="276" w:lineRule="auto"/>
-      </w:pPr>
       <w:r>
         <w:rPr>
           <w:rFonts w:ascii="Calibri" w:hAnsi="Calibri" w:eastAsia="Microsoft JhengHei"/>
@@ -2574,7 +2500,7 @@
     <w:p>
       <w:pPr>
         <w:pStyle w:val="ListBullet"/>
-        <w:spacing w:line="276" w:lineRule="auto" w:after="120"/>
+        <w:spacing w:line="240" w:lineRule="auto"/>
         <w:ind w:left="720"/>
       </w:pPr>
       <w:r>
@@ -2600,7 +2526,7 @@
     <w:p>
       <w:pPr>
         <w:pStyle w:val="ListBullet"/>
-        <w:spacing w:line="276" w:lineRule="auto" w:after="120"/>
+        <w:spacing w:line="240" w:lineRule="auto"/>
         <w:ind w:left="720"/>
       </w:pPr>
       <w:r>
@@ -2641,7 +2567,7 @@
     <w:p>
       <w:pPr>
         <w:pStyle w:val="ListBullet"/>
-        <w:spacing w:line="276" w:lineRule="auto" w:after="120"/>
+        <w:spacing w:line="240" w:lineRule="auto"/>
         <w:ind w:left="720"/>
       </w:pPr>
       <w:r>
@@ -2667,7 +2593,7 @@
     <w:p>
       <w:pPr>
         <w:pStyle w:val="ListBullet"/>
-        <w:spacing w:line="276" w:lineRule="auto" w:after="120"/>
+        <w:spacing w:line="240" w:lineRule="auto"/>
         <w:ind w:left="720"/>
       </w:pPr>
       <w:r>
@@ -2701,7 +2627,6 @@
         <w:pBdr>
           <w:bottom w:val="single" w:sz="6" w:space="1" w:color="auto"/>
         </w:pBdr>
-        <w:spacing w:after="120" w:line="276" w:lineRule="auto"/>
       </w:pPr>
       <w:r>
         <w:rPr>
@@ -2713,7 +2638,6 @@
     <w:p>
       <w:pPr>
         <w:pStyle w:val="Heading2"/>
-        <w:spacing w:after="120" w:line="276" w:lineRule="auto"/>
       </w:pPr>
       <w:r>
         <w:rPr>
@@ -2732,7 +2656,6 @@
     <w:p>
       <w:pPr>
         <w:pStyle w:val="Heading3"/>
-        <w:spacing w:after="120" w:line="276" w:lineRule="auto"/>
       </w:pPr>
       <w:r>
         <w:rPr>
@@ -2749,9 +2672,6 @@
       </w:r>
     </w:p>
     <w:p>
-      <w:pPr>
-        <w:spacing w:after="120" w:line="276" w:lineRule="auto"/>
-      </w:pPr>
       <w:r>
         <w:rPr>
           <w:rFonts w:ascii="Calibri" w:hAnsi="Calibri" w:eastAsia="Microsoft JhengHei"/>
@@ -2781,9 +2701,6 @@
       </w:r>
     </w:p>
     <w:p>
-      <w:pPr>
-        <w:spacing w:after="120" w:line="276" w:lineRule="auto"/>
-      </w:pPr>
       <w:r>
         <w:rPr>
           <w:rFonts w:ascii="Calibri" w:hAnsi="Calibri" w:eastAsia="Microsoft JhengHei"/>
@@ -2806,9 +2723,6 @@
       </w:r>
     </w:p>
     <w:p>
-      <w:pPr>
-        <w:spacing w:after="120" w:line="276" w:lineRule="auto"/>
-      </w:pPr>
       <w:r>
         <w:rPr>
           <w:rFonts w:ascii="Calibri" w:hAnsi="Calibri" w:eastAsia="Microsoft JhengHei"/>
@@ -2875,9 +2789,6 @@
       </w:r>
     </w:p>
     <w:p>
-      <w:pPr>
-        <w:spacing w:after="120" w:line="276" w:lineRule="auto"/>
-      </w:pPr>
       <w:r>
         <w:rPr>
           <w:rFonts w:ascii="Calibri" w:hAnsi="Calibri" w:eastAsia="Microsoft JhengHei"/>
@@ -2944,9 +2855,6 @@
       </w:r>
     </w:p>
     <w:p>
-      <w:pPr>
-        <w:spacing w:after="120" w:line="276" w:lineRule="auto"/>
-      </w:pPr>
       <w:r>
         <w:rPr>
           <w:rFonts w:ascii="Calibri" w:hAnsi="Calibri" w:eastAsia="Microsoft JhengHei"/>
@@ -2969,9 +2877,6 @@
       </w:r>
     </w:p>
     <w:p>
-      <w:pPr>
-        <w:spacing w:after="120" w:line="276" w:lineRule="auto"/>
-      </w:pPr>
       <w:r>
         <w:rPr>
           <w:rFonts w:ascii="Calibri" w:hAnsi="Calibri" w:eastAsia="Microsoft JhengHei"/>
@@ -3038,9 +2943,6 @@
       </w:r>
     </w:p>
     <w:p>
-      <w:pPr>
-        <w:spacing w:after="120" w:line="276" w:lineRule="auto"/>
-      </w:pPr>
       <w:r>
         <w:rPr>
           <w:rFonts w:ascii="Calibri" w:hAnsi="Calibri" w:eastAsia="Microsoft JhengHei"/>
@@ -3063,9 +2965,6 @@
       </w:r>
     </w:p>
     <w:p>
-      <w:pPr>
-        <w:spacing w:after="120" w:line="276" w:lineRule="auto"/>
-      </w:pPr>
       <w:r>
         <w:rPr>
           <w:rFonts w:ascii="Calibri" w:hAnsi="Calibri" w:eastAsia="Microsoft JhengHei"/>
@@ -3132,9 +3031,6 @@
       </w:r>
     </w:p>
     <w:p>
-      <w:pPr>
-        <w:spacing w:after="120" w:line="276" w:lineRule="auto"/>
-      </w:pPr>
       <w:r>
         <w:rPr>
           <w:rFonts w:ascii="Calibri" w:hAnsi="Calibri" w:eastAsia="Microsoft JhengHei"/>
@@ -3171,9 +3067,6 @@
       </w:r>
     </w:p>
     <w:p>
-      <w:pPr>
-        <w:spacing w:after="120" w:line="276" w:lineRule="auto"/>
-      </w:pPr>
       <w:r>
         <w:rPr>
           <w:rFonts w:ascii="Calibri" w:hAnsi="Calibri" w:eastAsia="Microsoft JhengHei"/>
@@ -3196,9 +3089,6 @@
       </w:r>
     </w:p>
     <w:p>
-      <w:pPr>
-        <w:spacing w:after="120" w:line="276" w:lineRule="auto"/>
-      </w:pPr>
       <w:r>
         <w:rPr>
           <w:rFonts w:ascii="Calibri" w:hAnsi="Calibri" w:eastAsia="Microsoft JhengHei"/>
@@ -3252,7 +3142,6 @@
     <w:p>
       <w:pPr>
         <w:pStyle w:val="Heading3"/>
-        <w:spacing w:after="120" w:line="276" w:lineRule="auto"/>
       </w:pPr>
       <w:r>
         <w:rPr>
@@ -3269,9 +3158,6 @@
       </w:r>
     </w:p>
     <w:p>
-      <w:pPr>
-        <w:spacing w:after="120" w:line="276" w:lineRule="auto"/>
-      </w:pPr>
       <w:r>
         <w:rPr>
           <w:rFonts w:ascii="Calibri" w:hAnsi="Calibri" w:eastAsia="Microsoft JhengHei"/>
@@ -3353,9 +3239,6 @@
       </w:r>
     </w:p>
     <w:p>
-      <w:pPr>
-        <w:spacing w:after="120" w:line="276" w:lineRule="auto"/>
-      </w:pPr>
       <w:r>
         <w:rPr>
           <w:rFonts w:ascii="Calibri" w:hAnsi="Calibri" w:eastAsia="Microsoft JhengHei"/>
@@ -3379,7 +3262,6 @@
     <w:p>
       <w:pPr>
         <w:pStyle w:val="Heading3"/>
-        <w:spacing w:after="120" w:line="276" w:lineRule="auto"/>
       </w:pPr>
       <w:r>
         <w:rPr>
@@ -3396,9 +3278,6 @@
       </w:r>
     </w:p>
     <w:p>
-      <w:pPr>
-        <w:spacing w:after="120" w:line="276" w:lineRule="auto"/>
-      </w:pPr>
       <w:r>
         <w:rPr>
           <w:rFonts w:ascii="Calibri" w:hAnsi="Calibri" w:eastAsia="Microsoft JhengHei"/>
@@ -3465,9 +3344,6 @@
       </w:r>
     </w:p>
     <w:p>
-      <w:pPr>
-        <w:spacing w:after="120" w:line="276" w:lineRule="auto"/>
-      </w:pPr>
       <w:r>
         <w:rPr>
           <w:rFonts w:ascii="Calibri" w:hAnsi="Calibri" w:eastAsia="Microsoft JhengHei"/>
@@ -3521,7 +3397,6 @@
     <w:p>
       <w:pPr>
         <w:pStyle w:val="Heading3"/>
-        <w:spacing w:after="120" w:line="276" w:lineRule="auto"/>
       </w:pPr>
       <w:r>
         <w:rPr>
@@ -3538,9 +3413,6 @@
       </w:r>
     </w:p>
     <w:p>
-      <w:pPr>
-        <w:spacing w:after="120" w:line="276" w:lineRule="auto"/>
-      </w:pPr>
       <w:r>
         <w:rPr>
           <w:rFonts w:ascii="Calibri" w:hAnsi="Calibri" w:eastAsia="Microsoft JhengHei"/>
@@ -3577,9 +3449,6 @@
       </w:r>
     </w:p>
     <w:p>
-      <w:pPr>
-        <w:spacing w:after="120" w:line="276" w:lineRule="auto"/>
-      </w:pPr>
       <w:r>
         <w:rPr>
           <w:rFonts w:ascii="Calibri" w:hAnsi="Calibri" w:eastAsia="Microsoft JhengHei"/>
@@ -3616,9 +3485,6 @@
       </w:r>
     </w:p>
     <w:p>
-      <w:pPr>
-        <w:spacing w:after="120" w:line="276" w:lineRule="auto"/>
-      </w:pPr>
       <w:r>
         <w:rPr>
           <w:rFonts w:ascii="Calibri" w:hAnsi="Calibri" w:eastAsia="Microsoft JhengHei"/>
@@ -3685,9 +3551,6 @@
       </w:r>
     </w:p>
     <w:p>
-      <w:pPr>
-        <w:spacing w:after="120" w:line="276" w:lineRule="auto"/>
-      </w:pPr>
       <w:r>
         <w:rPr>
           <w:rFonts w:ascii="Calibri" w:hAnsi="Calibri" w:eastAsia="Microsoft JhengHei"/>
@@ -3739,9 +3602,6 @@
       </w:r>
     </w:p>
     <w:p>
-      <w:pPr>
-        <w:spacing w:after="120" w:line="276" w:lineRule="auto"/>
-      </w:pPr>
       <w:r>
         <w:rPr>
           <w:rFonts w:ascii="Calibri" w:hAnsi="Calibri" w:eastAsia="Microsoft JhengHei"/>
@@ -3780,7 +3640,6 @@
     <w:p>
       <w:pPr>
         <w:pStyle w:val="Heading3"/>
-        <w:spacing w:after="120" w:line="276" w:lineRule="auto"/>
       </w:pPr>
       <w:r>
         <w:rPr>
@@ -3797,9 +3656,6 @@
       </w:r>
     </w:p>
     <w:p>
-      <w:pPr>
-        <w:spacing w:after="120" w:line="276" w:lineRule="auto"/>
-      </w:pPr>
       <w:r>
         <w:rPr>
           <w:rFonts w:ascii="Calibri" w:hAnsi="Calibri" w:eastAsia="Microsoft JhengHei"/>
@@ -3866,9 +3722,6 @@
       </w:r>
     </w:p>
     <w:p>
-      <w:pPr>
-        <w:spacing w:after="120" w:line="276" w:lineRule="auto"/>
-      </w:pPr>
       <w:r>
         <w:rPr>
           <w:rFonts w:ascii="Calibri" w:hAnsi="Calibri" w:eastAsia="Microsoft JhengHei"/>
@@ -3898,9 +3751,6 @@
       </w:r>
     </w:p>
     <w:p>
-      <w:pPr>
-        <w:spacing w:after="120" w:line="276" w:lineRule="auto"/>
-      </w:pPr>
       <w:r>
         <w:rPr>
           <w:rFonts w:ascii="Calibri" w:hAnsi="Calibri" w:eastAsia="Microsoft JhengHei"/>
@@ -3941,7 +3791,6 @@
         <w:pBdr>
           <w:bottom w:val="single" w:sz="6" w:space="1" w:color="auto"/>
         </w:pBdr>
-        <w:spacing w:after="120" w:line="276" w:lineRule="auto"/>
       </w:pPr>
       <w:r>
         <w:rPr>
@@ -3953,7 +3802,6 @@
     <w:p>
       <w:pPr>
         <w:pStyle w:val="Heading2"/>
-        <w:spacing w:after="120" w:line="276" w:lineRule="auto"/>
       </w:pPr>
       <w:r>
         <w:rPr>
@@ -4486,9 +4334,6 @@
       </w:tr>
     </w:tbl>
     <w:p>
-      <w:pPr>
-        <w:spacing w:after="120" w:line="276" w:lineRule="auto"/>
-      </w:pPr>
       <w:r>
         <w:rPr>
           <w:rFonts w:ascii="Calibri" w:hAnsi="Calibri" w:eastAsia="Microsoft JhengHei"/>
@@ -4501,7 +4346,6 @@
         <w:pBdr>
           <w:bottom w:val="single" w:sz="6" w:space="1" w:color="auto"/>
         </w:pBdr>
-        <w:spacing w:after="120" w:line="276" w:lineRule="auto"/>
       </w:pPr>
       <w:r>
         <w:rPr>
@@ -4513,69 +4357,336 @@
     <w:p>
       <w:pPr>
         <w:pStyle w:val="Heading2"/>
-        <w:spacing w:after="120" w:line="276" w:lineRule="auto"/>
       </w:pPr>
       <w:r>
         <w:rPr>
           <w:rFonts w:ascii="Calibri" w:hAnsi="Calibri" w:eastAsia="Microsoft JhengHei"/>
           <w:sz w:val="28"/>
         </w:rPr>
-        <w:t>收結（2 分鐘）</w:t>
+        <w:t>教授仲有機會問咩（visit report 不在本庫；用呢輪 + 養和私家 KOL 題庫）</w:t>
       </w:r>
       <w:r>
         <w:rPr>
           <w:rFonts w:ascii="Calibri" w:hAnsi="Calibri" w:eastAsia="Microsoft JhengHei"/>
           <w:sz w:val="28"/>
+        </w:rPr>
+      </w:r>
+      <w:r>
+        <w:rPr>
+          <w:rFonts w:ascii="Calibri" w:hAnsi="Calibri" w:eastAsia="Microsoft JhengHei"/>
+          <w:sz w:val="28"/>
+        </w:rPr>
+      </w:r>
+    </w:p>
+    <w:p>
+      <w:r>
+        <w:rPr>
+          <w:rFonts w:ascii="Calibri" w:hAnsi="Calibri" w:eastAsia="Microsoft JhengHei"/>
+          <w:sz w:val="22"/>
+        </w:rPr>
+      </w:r>
+      <w:r>
+        <w:rPr>
+          <w:rFonts w:ascii="Calibri" w:hAnsi="Calibri" w:eastAsia="Microsoft JhengHei"/>
+          <w:b/>
+          <w:sz w:val="22"/>
+        </w:rPr>
+        <w:t>資料缺口：</w:t>
+      </w:r>
+      <w:r>
+        <w:rPr>
+          <w:rFonts w:ascii="Calibri" w:hAnsi="Calibri" w:eastAsia="Microsoft JhengHei"/>
+          <w:sz w:val="22"/>
+        </w:rPr>
+        <w:t xml:space="preserve"> Git／work-briefs </w:t>
+      </w:r>
+      <w:r>
+        <w:rPr>
+          <w:rFonts w:ascii="Calibri" w:hAnsi="Calibri" w:eastAsia="Microsoft JhengHei"/>
+          <w:b/>
+          <w:sz w:val="22"/>
+        </w:rPr>
+        <w:t>冇</w:t>
+      </w:r>
+      <w:r>
+        <w:rPr>
+          <w:rFonts w:ascii="Calibri" w:hAnsi="Calibri" w:eastAsia="Microsoft JhengHei"/>
+          <w:sz w:val="22"/>
+        </w:rPr>
+        <w:t xml:space="preserve"> 之前 visit report 原文。以下係（1）你而家呢輪已出現嘅題（價錢、Pegasys、FDA、Hep B）；（2）養和私家、血液＋細胞治療中心、前 QMH／HA 榮譽顧問 </w:t>
+      </w:r>
+      <w:r>
+        <w:rPr>
+          <w:rFonts w:ascii="Calibri" w:hAnsi="Calibri" w:eastAsia="Microsoft JhengHei"/>
+          <w:b/>
+          <w:sz w:val="22"/>
+        </w:rPr>
+        <w:t>好大機會</w:t>
+      </w:r>
+      <w:r>
+        <w:rPr>
+          <w:rFonts w:ascii="Calibri" w:hAnsi="Calibri" w:eastAsia="Microsoft JhengHei"/>
+          <w:sz w:val="22"/>
+        </w:rPr>
+        <w:t xml:space="preserve"> 會問嘅題。如果你之後把 visit report 貼過嚟，可以再收窄。</w:t>
+      </w:r>
+      <w:r>
+        <w:rPr>
+          <w:rFonts w:ascii="Calibri" w:hAnsi="Calibri" w:eastAsia="Microsoft JhengHei"/>
+          <w:b/>
+          <w:sz w:val="22"/>
+        </w:rPr>
+        <w:t>唔好引 ad-board 逐字。</w:t>
+      </w:r>
+      <w:r>
+        <w:rPr>
+          <w:rFonts w:ascii="Calibri" w:hAnsi="Calibri" w:eastAsia="Microsoft JhengHei"/>
+          <w:sz w:val="22"/>
+        </w:rPr>
+      </w:r>
+      <w:r>
+        <w:rPr>
+          <w:rFonts w:ascii="Calibri" w:hAnsi="Calibri" w:eastAsia="Microsoft JhengHei"/>
+          <w:sz w:val="22"/>
         </w:rPr>
       </w:r>
     </w:p>
     <w:p>
       <w:pPr>
-        <w:spacing w:after="120" w:line="276" w:lineRule="auto"/>
+        <w:pStyle w:val="Heading3"/>
       </w:pPr>
       <w:r>
         <w:rPr>
           <w:rFonts w:ascii="Calibri" w:hAnsi="Calibri" w:eastAsia="Microsoft JhengHei"/>
-          <w:sz w:val="22"/>
-        </w:rPr>
-      </w:r>
-      <w:r>
-        <w:rPr>
-          <w:rFonts w:ascii="Calibri" w:hAnsi="Calibri" w:eastAsia="Microsoft JhengHei"/>
-          <w:sz w:val="22"/>
-        </w:rPr>
-        <w:t xml:space="preserve">「如果您試一位病人，標籤合適嘅係 </w:t>
-      </w:r>
-      <w:r>
-        <w:rPr>
-          <w:rFonts w:ascii="Calibri" w:hAnsi="Calibri" w:eastAsia="Microsoft JhengHei"/>
-          <w:b/>
-          <w:sz w:val="22"/>
-        </w:rPr>
-        <w:t>成年 PV、無症狀性脾腫大</w:t>
-      </w:r>
-      <w:r>
-        <w:rPr>
-          <w:rFonts w:ascii="Calibri" w:hAnsi="Calibri" w:eastAsia="Microsoft JhengHei"/>
-          <w:sz w:val="22"/>
-        </w:rPr>
-        <w:t xml:space="preserve">，而且您想要疾病導向嘅細胞減少，而唔係得一年 hematocrit 快照——好多時係 </w:t>
-      </w:r>
-      <w:r>
-        <w:rPr>
-          <w:rFonts w:ascii="Calibri" w:hAnsi="Calibri" w:eastAsia="Microsoft JhengHei"/>
-          <w:b/>
-          <w:sz w:val="22"/>
-        </w:rPr>
-        <w:t>HU 不耐受、放血負擔重、或者時間視野較長</w:t>
-      </w:r>
-      <w:r>
-        <w:rPr>
-          <w:rFonts w:ascii="Calibri" w:hAnsi="Calibri" w:eastAsia="Microsoft JhengHei"/>
-          <w:sz w:val="22"/>
-        </w:rPr>
-        <w:t>。</w:t>
-      </w:r>
+          <w:sz w:val="24"/>
+        </w:rPr>
+        <w:t>A. 呢輪已經出過 —— 一定要熟</w:t>
+      </w:r>
+      <w:r>
+        <w:rPr>
+          <w:rFonts w:ascii="Calibri" w:hAnsi="Calibri" w:eastAsia="Microsoft JhengHei"/>
+          <w:sz w:val="24"/>
+        </w:rPr>
+      </w:r>
+    </w:p>
+    <w:tbl>
+      <w:tblPr>
+        <w:tblStyle w:val="TableGrid"/>
+        <w:tblW w:type="auto" w:w="0"/>
+        <w:tblLook w:firstColumn="1" w:firstRow="1" w:lastColumn="0" w:lastRow="0" w:noHBand="0" w:noVBand="1" w:val="04A0"/>
+      </w:tblPr>
+      <w:tblGrid>
+        <w:gridCol w:w="4824"/>
+        <w:gridCol w:w="4824"/>
+      </w:tblGrid>
+      <w:tr>
+        <w:tc>
+          <w:tcPr>
+            <w:tcW w:type="dxa" w:w="4824"/>
+          </w:tcPr>
+          <w:p>
+            <w:r>
+              <w:rPr>
+                <w:rFonts w:ascii="Calibri" w:hAnsi="Calibri" w:eastAsia="Microsoft JhengHei"/>
+                <w:b/>
+                <w:sz w:val="20"/>
+              </w:rPr>
+              <w:t>佢問</w:t>
+            </w:r>
+          </w:p>
+        </w:tc>
+        <w:tc>
+          <w:tcPr>
+            <w:tcW w:type="dxa" w:w="4824"/>
+          </w:tcPr>
+          <w:p>
+            <w:r>
+              <w:rPr>
+                <w:rFonts w:ascii="Calibri" w:hAnsi="Calibri" w:eastAsia="Microsoft JhengHei"/>
+                <w:b/>
+                <w:sz w:val="20"/>
+              </w:rPr>
+              <w:t>你答（兩句）</w:t>
+            </w:r>
+          </w:p>
+        </w:tc>
+      </w:tr>
+      <w:tr>
+        <w:tc>
+          <w:tcPr>
+            <w:tcW w:type="dxa" w:w="4824"/>
+          </w:tcPr>
+          <w:p>
+            <w:r>
+              <w:rPr>
+                <w:rFonts w:ascii="Calibri" w:hAnsi="Calibri" w:eastAsia="Microsoft JhengHei"/>
+                <w:sz w:val="20"/>
+              </w:rPr>
+              <w:t>好貴／Pegasys 平啲</w:t>
+            </w:r>
+          </w:p>
+        </w:tc>
+        <w:tc>
+          <w:tcPr>
+            <w:tcW w:type="dxa" w:w="4824"/>
+          </w:tcPr>
+          <w:p>
+            <w:r>
+              <w:rPr>
+                <w:rFonts w:ascii="Calibri" w:hAnsi="Calibri" w:eastAsia="Microsoft JhengHei"/>
+                <w:sz w:val="20"/>
+              </w:rPr>
+              <w:t xml:space="preserve">認同貴。 </w:t>
+            </w:r>
+            <w:r>
+              <w:rPr>
+                <w:rFonts w:ascii="Calibri" w:hAnsi="Calibri" w:eastAsia="Microsoft JhengHei"/>
+                <w:b/>
+                <w:sz w:val="20"/>
+              </w:rPr>
+              <w:t>唔好比</w:t>
+            </w:r>
+            <w:r>
+              <w:rPr>
+                <w:rFonts w:ascii="Calibri" w:hAnsi="Calibri" w:eastAsia="Microsoft JhengHei"/>
+                <w:sz w:val="20"/>
+              </w:rPr>
+              <w:t xml:space="preserve"> Pegasys potency。價值 = vs HU 嘅 RCT + 自己 q2w／q4w + PSP。</w:t>
+            </w:r>
+          </w:p>
+        </w:tc>
+      </w:tr>
+      <w:tr>
+        <w:tc>
+          <w:tcPr>
+            <w:tcW w:type="dxa" w:w="4824"/>
+          </w:tcPr>
+          <w:p>
+            <w:r>
+              <w:rPr>
+                <w:rFonts w:ascii="Calibri" w:hAnsi="Calibri" w:eastAsia="Microsoft JhengHei"/>
+                <w:sz w:val="20"/>
+              </w:rPr>
+              <w:t>Dosage 多過／針少過 Pegasys</w:t>
+            </w:r>
+          </w:p>
+        </w:tc>
+        <w:tc>
+          <w:tcPr>
+            <w:tcW w:type="dxa" w:w="4824"/>
+          </w:tcPr>
+          <w:p>
+            <w:r>
+              <w:rPr>
+                <w:rFonts w:ascii="Calibri" w:hAnsi="Calibri" w:eastAsia="Microsoft JhengHei"/>
+                <w:b/>
+                <w:sz w:val="20"/>
+              </w:rPr>
+              <w:t>唔講。</w:t>
+            </w:r>
+            <w:r>
+              <w:rPr>
+                <w:rFonts w:ascii="Calibri" w:hAnsi="Calibri" w:eastAsia="Microsoft JhengHei"/>
+                <w:sz w:val="20"/>
+              </w:rPr>
+              <w:t xml:space="preserve"> 只講 BESREMi PI：q2w，穩 1.5 年可 q4w。</w:t>
+            </w:r>
+          </w:p>
+        </w:tc>
+      </w:tr>
+      <w:tr>
+        <w:tc>
+          <w:tcPr>
+            <w:tcW w:type="dxa" w:w="4824"/>
+          </w:tcPr>
+          <w:p>
+            <w:r>
+              <w:rPr>
+                <w:rFonts w:ascii="Calibri" w:hAnsi="Calibri" w:eastAsia="Microsoft JhengHei"/>
+                <w:sz w:val="20"/>
+              </w:rPr>
+              <w:t>Hep B 證明安全啲</w:t>
+            </w:r>
+          </w:p>
+        </w:tc>
+        <w:tc>
+          <w:tcPr>
+            <w:tcW w:type="dxa" w:w="4824"/>
+          </w:tcPr>
+          <w:p>
+            <w:r>
+              <w:rPr>
+                <w:rFonts w:ascii="Calibri" w:hAnsi="Calibri" w:eastAsia="Microsoft JhengHei"/>
+                <w:b/>
+                <w:sz w:val="20"/>
+              </w:rPr>
+              <w:t>唔得。</w:t>
+            </w:r>
+            <w:r>
+              <w:rPr>
+                <w:rFonts w:ascii="Calibri" w:hAnsi="Calibri" w:eastAsia="Microsoft JhengHei"/>
+                <w:sz w:val="20"/>
+              </w:rPr>
+              <w:t xml:space="preserve"> 病唔同、藥唔同；MPN 冇 H2H。</w:t>
+            </w:r>
+          </w:p>
+        </w:tc>
+      </w:tr>
+      <w:tr>
+        <w:tc>
+          <w:tcPr>
+            <w:tcW w:type="dxa" w:w="4824"/>
+          </w:tcPr>
+          <w:p>
+            <w:r>
+              <w:rPr>
+                <w:rFonts w:ascii="Calibri" w:hAnsi="Calibri" w:eastAsia="Microsoft JhengHei"/>
+                <w:sz w:val="20"/>
+              </w:rPr>
+              <w:t>第一隻 FDA PV 藥？</w:t>
+            </w:r>
+          </w:p>
+        </w:tc>
+        <w:tc>
+          <w:tcPr>
+            <w:tcW w:type="dxa" w:w="4824"/>
+          </w:tcPr>
+          <w:p>
+            <w:r>
+              <w:rPr>
+                <w:rFonts w:ascii="Calibri" w:hAnsi="Calibri" w:eastAsia="Microsoft JhengHei"/>
+                <w:b/>
+                <w:sz w:val="20"/>
+              </w:rPr>
+              <w:t>唔好咁講。</w:t>
+            </w:r>
+            <w:r>
+              <w:rPr>
+                <w:rFonts w:ascii="Calibri" w:hAnsi="Calibri" w:eastAsia="Microsoft JhengHei"/>
+                <w:sz w:val="20"/>
+              </w:rPr>
+              <w:t xml:space="preserve"> 第一隻 FDA </w:t>
+            </w:r>
+            <w:r>
+              <w:rPr>
+                <w:rFonts w:ascii="Calibri" w:hAnsi="Calibri" w:eastAsia="Microsoft JhengHei"/>
+                <w:b/>
+                <w:sz w:val="20"/>
+              </w:rPr>
+              <w:t>專門批 PV 嘅干擾素</w:t>
+            </w:r>
+            <w:r>
+              <w:rPr>
+                <w:rFonts w:ascii="Calibri" w:hAnsi="Calibri" w:eastAsia="Microsoft JhengHei"/>
+                <w:sz w:val="20"/>
+              </w:rPr>
+              <w:t xml:space="preserve"> ；rux 2014 已批（HU 之後）。香港跟香港 PI。</w:t>
+            </w:r>
+          </w:p>
+        </w:tc>
+      </w:tr>
+    </w:tbl>
+    <w:p>
       <w:r>
         <w:rPr>
           <w:rFonts w:ascii="Calibri" w:hAnsi="Calibri" w:eastAsia="Microsoft JhengHei"/>
@@ -4585,21 +4696,900 @@
     </w:p>
     <w:p>
       <w:pPr>
-        <w:spacing w:after="120" w:line="276" w:lineRule="auto"/>
+        <w:pStyle w:val="Heading3"/>
       </w:pPr>
       <w:r>
         <w:rPr>
           <w:rFonts w:ascii="Calibri" w:hAnsi="Calibri" w:eastAsia="Microsoft JhengHei"/>
-          <w:sz w:val="22"/>
-        </w:rPr>
-      </w:r>
-      <w:r>
-        <w:rPr>
-          <w:rFonts w:ascii="Calibri" w:hAnsi="Calibri" w:eastAsia="Microsoft JhengHei"/>
-          <w:sz w:val="22"/>
-        </w:rPr>
-        <w:t>您需要我哋邊樣：護士注射培訓、PSP 文件，定係 Medical 跟進某個 protocol 問題？</w:t>
-      </w:r>
+          <w:sz w:val="24"/>
+        </w:rPr>
+        <w:t>B. 好大機會（私家養和 + 你哋平時 field 會撞）</w:t>
+      </w:r>
+      <w:r>
+        <w:rPr>
+          <w:rFonts w:ascii="Calibri" w:hAnsi="Calibri" w:eastAsia="Microsoft JhengHei"/>
+          <w:sz w:val="24"/>
+        </w:rPr>
+      </w:r>
+    </w:p>
+    <w:tbl>
+      <w:tblPr>
+        <w:tblStyle w:val="TableGrid"/>
+        <w:tblW w:type="auto" w:w="0"/>
+        <w:tblLook w:firstColumn="1" w:firstRow="1" w:lastColumn="0" w:lastRow="0" w:noHBand="0" w:noVBand="1" w:val="04A0"/>
+      </w:tblPr>
+      <w:tblGrid>
+        <w:gridCol w:w="4824"/>
+        <w:gridCol w:w="4824"/>
+      </w:tblGrid>
+      <w:tr>
+        <w:tc>
+          <w:tcPr>
+            <w:tcW w:type="dxa" w:w="4824"/>
+          </w:tcPr>
+          <w:p>
+            <w:r>
+              <w:rPr>
+                <w:rFonts w:ascii="Calibri" w:hAnsi="Calibri" w:eastAsia="Microsoft JhengHei"/>
+                <w:b/>
+                <w:sz w:val="20"/>
+              </w:rPr>
+              <w:t>佢問</w:t>
+            </w:r>
+          </w:p>
+        </w:tc>
+        <w:tc>
+          <w:tcPr>
+            <w:tcW w:type="dxa" w:w="4824"/>
+          </w:tcPr>
+          <w:p>
+            <w:r>
+              <w:rPr>
+                <w:rFonts w:ascii="Calibri" w:hAnsi="Calibri" w:eastAsia="Microsoft JhengHei"/>
+                <w:b/>
+                <w:sz w:val="20"/>
+              </w:rPr>
+              <w:t>你答</w:t>
+            </w:r>
+          </w:p>
+        </w:tc>
+      </w:tr>
+      <w:tr>
+        <w:tc>
+          <w:tcPr>
+            <w:tcW w:type="dxa" w:w="4824"/>
+          </w:tcPr>
+          <w:p>
+            <w:r>
+              <w:rPr>
+                <w:rFonts w:ascii="Calibri" w:hAnsi="Calibri" w:eastAsia="Microsoft JhengHei"/>
+                <w:sz w:val="20"/>
+              </w:rPr>
+              <w:t>穩定 HU 病人點解要轉？</w:t>
+            </w:r>
+          </w:p>
+        </w:tc>
+        <w:tc>
+          <w:tcPr>
+            <w:tcW w:type="dxa" w:w="4824"/>
+          </w:tcPr>
+          <w:p>
+            <w:r>
+              <w:rPr>
+                <w:rFonts w:ascii="Calibri" w:hAnsi="Calibri" w:eastAsia="Microsoft JhengHei"/>
+                <w:sz w:val="20"/>
+              </w:rPr>
+              <w:t xml:space="preserve">唔係人人要轉。適合：HU 毒性／不耐受、放血負擔重、想長期 CHR／JAK2 方向、 </w:t>
+            </w:r>
+            <w:r>
+              <w:rPr>
+                <w:rFonts w:ascii="Calibri" w:hAnsi="Calibri" w:eastAsia="Microsoft JhengHei"/>
+                <w:b/>
+                <w:sz w:val="20"/>
+              </w:rPr>
+              <w:t>無症狀性脾腫大</w:t>
+            </w:r>
+            <w:r>
+              <w:rPr>
+                <w:rFonts w:ascii="Calibri" w:hAnsi="Calibri" w:eastAsia="Microsoft JhengHei"/>
+                <w:sz w:val="20"/>
+              </w:rPr>
+              <w:t xml:space="preserve"> 。HU 第一年仍然快啲。</w:t>
+            </w:r>
+          </w:p>
+        </w:tc>
+      </w:tr>
+      <w:tr>
+        <w:tc>
+          <w:tcPr>
+            <w:tcW w:type="dxa" w:w="4824"/>
+          </w:tcPr>
+          <w:p>
+            <w:r>
+              <w:rPr>
+                <w:rFonts w:ascii="Calibri" w:hAnsi="Calibri" w:eastAsia="Microsoft JhengHei"/>
+                <w:sz w:val="20"/>
+              </w:rPr>
+              <w:t>已經用緊 Pegasys，點 switch？</w:t>
+            </w:r>
+          </w:p>
+        </w:tc>
+        <w:tc>
+          <w:tcPr>
+            <w:tcW w:type="dxa" w:w="4824"/>
+          </w:tcPr>
+          <w:p>
+            <w:r>
+              <w:rPr>
+                <w:rFonts w:ascii="Calibri" w:hAnsi="Calibri" w:eastAsia="Microsoft JhengHei"/>
+                <w:sz w:val="20"/>
+              </w:rPr>
+              <w:t xml:space="preserve">PI：已用其他細胞減少藥， </w:t>
+            </w:r>
+            <w:r>
+              <w:rPr>
+                <w:rFonts w:ascii="Calibri" w:hAnsi="Calibri" w:eastAsia="Microsoft JhengHei"/>
+                <w:b/>
+                <w:sz w:val="20"/>
+              </w:rPr>
+              <w:t>起始 50 µg</w:t>
+            </w:r>
+            <w:r>
+              <w:rPr>
+                <w:rFonts w:ascii="Calibri" w:hAnsi="Calibri" w:eastAsia="Microsoft JhengHei"/>
+                <w:sz w:val="20"/>
+              </w:rPr>
+              <w:t xml:space="preserve"> q2w，一邊加 ropeg 一邊 taper 舊藥。唔好比邊隻 IFN 勁。Veeva 記。</w:t>
+            </w:r>
+          </w:p>
+        </w:tc>
+      </w:tr>
+      <w:tr>
+        <w:tc>
+          <w:tcPr>
+            <w:tcW w:type="dxa" w:w="4824"/>
+          </w:tcPr>
+          <w:p>
+            <w:r>
+              <w:rPr>
+                <w:rFonts w:ascii="Calibri" w:hAnsi="Calibri" w:eastAsia="Microsoft JhengHei"/>
+                <w:sz w:val="20"/>
+              </w:rPr>
+              <w:t>由 250–350–500 開始（HIDAT／台灣）？</w:t>
+            </w:r>
+          </w:p>
+        </w:tc>
+        <w:tc>
+          <w:tcPr>
+            <w:tcW w:type="dxa" w:w="4824"/>
+          </w:tcPr>
+          <w:p>
+            <w:r>
+              <w:rPr>
+                <w:rFonts w:ascii="Calibri" w:hAnsi="Calibri" w:eastAsia="Microsoft JhengHei"/>
+                <w:b/>
+                <w:sz w:val="20"/>
+              </w:rPr>
+              <w:t>香港 PI 100／50 µg</w:t>
+            </w:r>
+            <w:r>
+              <w:rPr>
+                <w:rFonts w:ascii="Calibri" w:hAnsi="Calibri" w:eastAsia="Microsoft JhengHei"/>
+                <w:sz w:val="20"/>
+              </w:rPr>
+              <w:t xml:space="preserve"> ，+50 q2w，最高 500。HIDAT 唔係本地標籤。</w:t>
+            </w:r>
+          </w:p>
+        </w:tc>
+      </w:tr>
+      <w:tr>
+        <w:tc>
+          <w:tcPr>
+            <w:tcW w:type="dxa" w:w="4824"/>
+          </w:tcPr>
+          <w:p>
+            <w:r>
+              <w:rPr>
+                <w:rFonts w:ascii="Calibri" w:hAnsi="Calibri" w:eastAsia="Microsoft JhengHei"/>
+                <w:sz w:val="20"/>
+              </w:rPr>
+              <w:t>有症狀性脾腫大／中國人 PV 好多脾（歷史系列）？</w:t>
+            </w:r>
+          </w:p>
+        </w:tc>
+        <w:tc>
+          <w:tcPr>
+            <w:tcW w:type="dxa" w:w="4824"/>
+          </w:tcPr>
+          <w:p>
+            <w:r>
+              <w:rPr>
+                <w:rFonts w:ascii="Calibri" w:hAnsi="Calibri" w:eastAsia="Microsoft JhengHei"/>
+                <w:sz w:val="20"/>
+              </w:rPr>
+              <w:t xml:space="preserve">香港適應證 </w:t>
+            </w:r>
+            <w:r>
+              <w:rPr>
+                <w:rFonts w:ascii="Calibri" w:hAnsi="Calibri" w:eastAsia="Microsoft JhengHei"/>
+                <w:b/>
+                <w:sz w:val="20"/>
+              </w:rPr>
+              <w:t>無症狀性脾腫大</w:t>
+            </w:r>
+            <w:r>
+              <w:rPr>
+                <w:rFonts w:ascii="Calibri" w:hAnsi="Calibri" w:eastAsia="Microsoft JhengHei"/>
+                <w:sz w:val="20"/>
+              </w:rPr>
+              <w:t xml:space="preserve"> 。有症狀性脾 = </w:t>
+            </w:r>
+            <w:r>
+              <w:rPr>
+                <w:rFonts w:ascii="Calibri" w:hAnsi="Calibri" w:eastAsia="Microsoft JhengHei"/>
+                <w:b/>
+                <w:sz w:val="20"/>
+              </w:rPr>
+              <w:t>唔好</w:t>
+            </w:r>
+            <w:r>
+              <w:rPr>
+                <w:rFonts w:ascii="Calibri" w:hAnsi="Calibri" w:eastAsia="Microsoft JhengHei"/>
+                <w:sz w:val="20"/>
+              </w:rPr>
+              <w:t xml:space="preserve"> 主動推。歷史 HK 系列唔好當而家風險模型。</w:t>
+            </w:r>
+          </w:p>
+        </w:tc>
+      </w:tr>
+      <w:tr>
+        <w:tc>
+          <w:tcPr>
+            <w:tcW w:type="dxa" w:w="4824"/>
+          </w:tcPr>
+          <w:p>
+            <w:r>
+              <w:rPr>
+                <w:rFonts w:ascii="Calibri" w:hAnsi="Calibri" w:eastAsia="Microsoft JhengHei"/>
+                <w:sz w:val="20"/>
+              </w:rPr>
+              <w:t>醫管局幾時納入？公立病人點算？</w:t>
+            </w:r>
+          </w:p>
+        </w:tc>
+        <w:tc>
+          <w:tcPr>
+            <w:tcW w:type="dxa" w:w="4824"/>
+          </w:tcPr>
+          <w:p>
+            <w:r>
+              <w:rPr>
+                <w:rFonts w:ascii="Calibri" w:hAnsi="Calibri" w:eastAsia="Microsoft JhengHei"/>
+                <w:b/>
+                <w:sz w:val="20"/>
+              </w:rPr>
+              <w:t>未納入，冇日期。</w:t>
+            </w:r>
+            <w:r>
+              <w:rPr>
+                <w:rFonts w:ascii="Calibri" w:hAnsi="Calibri" w:eastAsia="Microsoft JhengHei"/>
+                <w:sz w:val="20"/>
+              </w:rPr>
+              <w:t xml:space="preserve"> 而家係私家 + PSP。唔好承諾。</w:t>
+            </w:r>
+          </w:p>
+        </w:tc>
+      </w:tr>
+      <w:tr>
+        <w:tc>
+          <w:tcPr>
+            <w:tcW w:type="dxa" w:w="4824"/>
+          </w:tcPr>
+          <w:p>
+            <w:r>
+              <w:rPr>
+                <w:rFonts w:ascii="Calibri" w:hAnsi="Calibri" w:eastAsia="Microsoft JhengHei"/>
+                <w:sz w:val="20"/>
+              </w:rPr>
+              <w:t>PSP 2026 完咗點算？</w:t>
+            </w:r>
+          </w:p>
+        </w:tc>
+        <w:tc>
+          <w:tcPr>
+            <w:tcW w:type="dxa" w:w="4824"/>
+          </w:tcPr>
+          <w:p>
+            <w:r>
+              <w:rPr>
+                <w:rFonts w:ascii="Calibri" w:hAnsi="Calibri" w:eastAsia="Microsoft JhengHei"/>
+                <w:sz w:val="20"/>
+              </w:rPr>
+              <w:t xml:space="preserve">Private Sector </w:t>
+            </w:r>
+            <w:r>
+              <w:rPr>
+                <w:rFonts w:ascii="Calibri" w:hAnsi="Calibri" w:eastAsia="Microsoft JhengHei"/>
+                <w:b/>
+                <w:sz w:val="20"/>
+              </w:rPr>
+              <w:t>買 2 送 1、第一年、2026 年底完</w:t>
+            </w:r>
+            <w:r>
+              <w:rPr>
+                <w:rFonts w:ascii="Calibri" w:hAnsi="Calibri" w:eastAsia="Microsoft JhengHei"/>
+                <w:sz w:val="20"/>
+              </w:rPr>
+              <w:t xml:space="preserve"> 。之後條款未批之前 </w:t>
+            </w:r>
+            <w:r>
+              <w:rPr>
+                <w:rFonts w:ascii="Calibri" w:hAnsi="Calibri" w:eastAsia="Microsoft JhengHei"/>
+                <w:b/>
+                <w:sz w:val="20"/>
+              </w:rPr>
+              <w:t>唔好發明</w:t>
+            </w:r>
+            <w:r>
+              <w:rPr>
+                <w:rFonts w:ascii="Calibri" w:hAnsi="Calibri" w:eastAsia="Microsoft JhengHei"/>
+                <w:sz w:val="20"/>
+              </w:rPr>
+              <w:t xml:space="preserve"> 。Base Case（買 5 送 1）係另一個 live programme，核過先講。</w:t>
+            </w:r>
+          </w:p>
+        </w:tc>
+      </w:tr>
+      <w:tr>
+        <w:tc>
+          <w:tcPr>
+            <w:tcW w:type="dxa" w:w="4824"/>
+          </w:tcPr>
+          <w:p>
+            <w:r>
+              <w:rPr>
+                <w:rFonts w:ascii="Calibri" w:hAnsi="Calibri" w:eastAsia="Microsoft JhengHei"/>
+                <w:sz w:val="20"/>
+              </w:rPr>
+              <w:t>保險／養和 package 包唔包？</w:t>
+            </w:r>
+          </w:p>
+        </w:tc>
+        <w:tc>
+          <w:tcPr>
+            <w:tcW w:type="dxa" w:w="4824"/>
+          </w:tcPr>
+          <w:p>
+            <w:r>
+              <w:rPr>
+                <w:rFonts w:ascii="Calibri" w:hAnsi="Calibri" w:eastAsia="Microsoft JhengHei"/>
+                <w:sz w:val="20"/>
+              </w:rPr>
+              <w:t>唔好代保險公司答。可以幫病人／院務問事前授權；臨床決定仍然係適應證。</w:t>
+            </w:r>
+          </w:p>
+        </w:tc>
+      </w:tr>
+      <w:tr>
+        <w:tc>
+          <w:tcPr>
+            <w:tcW w:type="dxa" w:w="4824"/>
+          </w:tcPr>
+          <w:p>
+            <w:r>
+              <w:rPr>
+                <w:rFonts w:ascii="Calibri" w:hAnsi="Calibri" w:eastAsia="Microsoft JhengHei"/>
+                <w:sz w:val="20"/>
+              </w:rPr>
+              <w:t>邊個打針？病人自己打得唔得？</w:t>
+            </w:r>
+          </w:p>
+        </w:tc>
+        <w:tc>
+          <w:tcPr>
+            <w:tcW w:type="dxa" w:w="4824"/>
+          </w:tcPr>
+          <w:p>
+            <w:r>
+              <w:rPr>
+                <w:rFonts w:ascii="Calibri" w:hAnsi="Calibri" w:eastAsia="Microsoft JhengHei"/>
+                <w:sz w:val="20"/>
+              </w:rPr>
+              <w:t xml:space="preserve">PI：醫生、護士、家人或病人 </w:t>
+            </w:r>
+            <w:r>
+              <w:rPr>
+                <w:rFonts w:ascii="Calibri" w:hAnsi="Calibri" w:eastAsia="Microsoft JhengHei"/>
+                <w:b/>
+                <w:sz w:val="20"/>
+              </w:rPr>
+              <w:t>受訓後</w:t>
+            </w:r>
+            <w:r>
+              <w:rPr>
+                <w:rFonts w:ascii="Calibri" w:hAnsi="Calibri" w:eastAsia="Microsoft JhengHei"/>
+                <w:sz w:val="20"/>
+              </w:rPr>
+              <w:t xml:space="preserve"> 可 SC（腹／大腿）。可以安排注射培訓。</w:t>
+            </w:r>
+          </w:p>
+        </w:tc>
+      </w:tr>
+      <w:tr>
+        <w:tc>
+          <w:tcPr>
+            <w:tcW w:type="dxa" w:w="4824"/>
+          </w:tcPr>
+          <w:p>
+            <w:r>
+              <w:rPr>
+                <w:rFonts w:ascii="Calibri" w:hAnsi="Calibri" w:eastAsia="Microsoft JhengHei"/>
+                <w:sz w:val="20"/>
+              </w:rPr>
+              <w:t>雪櫃／外出？</w:t>
+            </w:r>
+          </w:p>
+        </w:tc>
+        <w:tc>
+          <w:tcPr>
+            <w:tcW w:type="dxa" w:w="4824"/>
+          </w:tcPr>
+          <w:p>
+            <w:r>
+              <w:rPr>
+                <w:rFonts w:ascii="Calibri" w:hAnsi="Calibri" w:eastAsia="Microsoft JhengHei"/>
+                <w:b/>
+                <w:sz w:val="20"/>
+              </w:rPr>
+              <w:t>2–8°C</w:t>
+            </w:r>
+            <w:r>
+              <w:rPr>
+                <w:rFonts w:ascii="Calibri" w:hAnsi="Calibri" w:eastAsia="Microsoft JhengHei"/>
+                <w:sz w:val="20"/>
+              </w:rPr>
+              <w:t xml:space="preserve"> ，唔好結冰；用前室溫最多約 15 分鐘。冷鏈唔穩就唔好交病人自己拎去。</w:t>
+            </w:r>
+          </w:p>
+        </w:tc>
+      </w:tr>
+      <w:tr>
+        <w:tc>
+          <w:tcPr>
+            <w:tcW w:type="dxa" w:w="4824"/>
+          </w:tcPr>
+          <w:p>
+            <w:r>
+              <w:rPr>
+                <w:rFonts w:ascii="Calibri" w:hAnsi="Calibri" w:eastAsia="Microsoft JhengHei"/>
+                <w:sz w:val="20"/>
+              </w:rPr>
+              <w:t>同 HU 一齊用？</w:t>
+            </w:r>
+          </w:p>
+        </w:tc>
+        <w:tc>
+          <w:tcPr>
+            <w:tcW w:type="dxa" w:w="4824"/>
+          </w:tcPr>
+          <w:p>
+            <w:r>
+              <w:rPr>
+                <w:rFonts w:ascii="Calibri" w:hAnsi="Calibri" w:eastAsia="Microsoft JhengHei"/>
+                <w:sz w:val="20"/>
+              </w:rPr>
+              <w:t xml:space="preserve">滴定期可以 </w:t>
+            </w:r>
+            <w:r>
+              <w:rPr>
+                <w:rFonts w:ascii="Calibri" w:hAnsi="Calibri" w:eastAsia="Microsoft JhengHei"/>
+                <w:b/>
+                <w:sz w:val="20"/>
+              </w:rPr>
+              <w:t>並行 taper</w:t>
+            </w:r>
+            <w:r>
+              <w:rPr>
+                <w:rFonts w:ascii="Calibri" w:hAnsi="Calibri" w:eastAsia="Microsoft JhengHei"/>
+                <w:sz w:val="20"/>
+              </w:rPr>
+              <w:t xml:space="preserve"> 舊細胞減少藥，唔係長期雙藥當標準。跟 PI。</w:t>
+            </w:r>
+          </w:p>
+        </w:tc>
+      </w:tr>
+      <w:tr>
+        <w:tc>
+          <w:tcPr>
+            <w:tcW w:type="dxa" w:w="4824"/>
+          </w:tcPr>
+          <w:p>
+            <w:r>
+              <w:rPr>
+                <w:rFonts w:ascii="Calibri" w:hAnsi="Calibri" w:eastAsia="Microsoft JhengHei"/>
+                <w:sz w:val="20"/>
+              </w:rPr>
+              <w:t>幾時可以每四星期？</w:t>
+            </w:r>
+          </w:p>
+        </w:tc>
+        <w:tc>
+          <w:tcPr>
+            <w:tcW w:type="dxa" w:w="4824"/>
+          </w:tcPr>
+          <w:p>
+            <w:r>
+              <w:rPr>
+                <w:rFonts w:ascii="Calibri" w:hAnsi="Calibri" w:eastAsia="Microsoft JhengHei"/>
+                <w:sz w:val="20"/>
+              </w:rPr>
+              <w:t xml:space="preserve">穩定劑量維持 q2w </w:t>
+            </w:r>
+            <w:r>
+              <w:rPr>
+                <w:rFonts w:ascii="Calibri" w:hAnsi="Calibri" w:eastAsia="Microsoft JhengHei"/>
+                <w:b/>
+                <w:sz w:val="20"/>
+              </w:rPr>
+              <w:t>至少 1.5 年</w:t>
+            </w:r>
+            <w:r>
+              <w:rPr>
+                <w:rFonts w:ascii="Calibri" w:hAnsi="Calibri" w:eastAsia="Microsoft JhengHei"/>
+                <w:sz w:val="20"/>
+              </w:rPr>
+              <w:t xml:space="preserve"> ，之後先 </w:t>
+            </w:r>
+            <w:r>
+              <w:rPr>
+                <w:rFonts w:ascii="Calibri" w:hAnsi="Calibri" w:eastAsia="Microsoft JhengHei"/>
+                <w:b/>
+                <w:sz w:val="20"/>
+              </w:rPr>
+              <w:t>可以</w:t>
+            </w:r>
+            <w:r>
+              <w:rPr>
+                <w:rFonts w:ascii="Calibri" w:hAnsi="Calibri" w:eastAsia="Microsoft JhengHei"/>
+                <w:sz w:val="20"/>
+              </w:rPr>
+              <w:t xml:space="preserve"> 拉長到 q4w。</w:t>
+            </w:r>
+          </w:p>
+        </w:tc>
+      </w:tr>
+      <w:tr>
+        <w:tc>
+          <w:tcPr>
+            <w:tcW w:type="dxa" w:w="4824"/>
+          </w:tcPr>
+          <w:p>
+            <w:r>
+              <w:rPr>
+                <w:rFonts w:ascii="Calibri" w:hAnsi="Calibri" w:eastAsia="Microsoft JhengHei"/>
+                <w:sz w:val="20"/>
+              </w:rPr>
+              <w:t>JAK2 幾耐 check 一次？停唔停到？</w:t>
+            </w:r>
+          </w:p>
+        </w:tc>
+        <w:tc>
+          <w:tcPr>
+            <w:tcW w:type="dxa" w:w="4824"/>
+          </w:tcPr>
+          <w:p>
+            <w:r>
+              <w:rPr>
+                <w:rFonts w:ascii="Calibri" w:hAnsi="Calibri" w:eastAsia="Microsoft JhengHei"/>
+                <w:sz w:val="20"/>
+              </w:rPr>
+              <w:t xml:space="preserve">Brochure 係長期下降 vs HU rebound。 </w:t>
+            </w:r>
+            <w:r>
+              <w:rPr>
+                <w:rFonts w:ascii="Calibri" w:hAnsi="Calibri" w:eastAsia="Microsoft JhengHei"/>
+                <w:b/>
+                <w:sz w:val="20"/>
+              </w:rPr>
+              <w:t>8% 唔係停藥線</w:t>
+            </w:r>
+            <w:r>
+              <w:rPr>
+                <w:rFonts w:ascii="Calibri" w:hAnsi="Calibri" w:eastAsia="Microsoft JhengHei"/>
+                <w:sz w:val="20"/>
+              </w:rPr>
+              <w:t xml:space="preserve"> ，冇 TFR。監測頻率交返臨床，唔好發明 protocol。</w:t>
+            </w:r>
+          </w:p>
+        </w:tc>
+      </w:tr>
+      <w:tr>
+        <w:tc>
+          <w:tcPr>
+            <w:tcW w:type="dxa" w:w="4824"/>
+          </w:tcPr>
+          <w:p>
+            <w:r>
+              <w:rPr>
+                <w:rFonts w:ascii="Calibri" w:hAnsi="Calibri" w:eastAsia="Microsoft JhengHei"/>
+                <w:sz w:val="20"/>
+              </w:rPr>
+              <w:t>對 ruxolitinib 點排？</w:t>
+            </w:r>
+          </w:p>
+        </w:tc>
+        <w:tc>
+          <w:tcPr>
+            <w:tcW w:type="dxa" w:w="4824"/>
+          </w:tcPr>
+          <w:p>
+            <w:r>
+              <w:rPr>
+                <w:rFonts w:ascii="Calibri" w:hAnsi="Calibri" w:eastAsia="Microsoft JhengHei"/>
+                <w:sz w:val="20"/>
+              </w:rPr>
+              <w:t>唔好比邊隻贏。Rux 喺 NCCN 高危 HU 後有位置；香港 BESREMi 適應證唔係「贏 rux」。跟病人脾、先前治療、標籤。</w:t>
+            </w:r>
+          </w:p>
+        </w:tc>
+      </w:tr>
+      <w:tr>
+        <w:tc>
+          <w:tcPr>
+            <w:tcW w:type="dxa" w:w="4824"/>
+          </w:tcPr>
+          <w:p>
+            <w:r>
+              <w:rPr>
+                <w:rFonts w:ascii="Calibri" w:hAnsi="Calibri" w:eastAsia="Microsoft JhengHei"/>
+                <w:sz w:val="20"/>
+              </w:rPr>
+              <w:t>年輕／想生育／懷孕？</w:t>
+            </w:r>
+          </w:p>
+        </w:tc>
+        <w:tc>
+          <w:tcPr>
+            <w:tcW w:type="dxa" w:w="4824"/>
+          </w:tcPr>
+          <w:p>
+            <w:r>
+              <w:rPr>
+                <w:rFonts w:ascii="Calibri" w:hAnsi="Calibri" w:eastAsia="Microsoft JhengHei"/>
+                <w:sz w:val="20"/>
+              </w:rPr>
+              <w:t xml:space="preserve">PI： </w:t>
+            </w:r>
+            <w:r>
+              <w:rPr>
+                <w:rFonts w:ascii="Calibri" w:hAnsi="Calibri" w:eastAsia="Microsoft JhengHei"/>
+                <w:b/>
+                <w:sz w:val="20"/>
+              </w:rPr>
+              <w:t>懷孕唔建議</w:t>
+            </w:r>
+            <w:r>
+              <w:rPr>
+                <w:rFonts w:ascii="Calibri" w:hAnsi="Calibri" w:eastAsia="Microsoft JhengHei"/>
+                <w:sz w:val="20"/>
+              </w:rPr>
+              <w:t xml:space="preserve"> ；治療期間 + 停藥後至少 14 日避孕。 </w:t>
+            </w:r>
+            <w:r>
+              <w:rPr>
+                <w:rFonts w:ascii="Calibri" w:hAnsi="Calibri" w:eastAsia="Microsoft JhengHei"/>
+                <w:b/>
+                <w:sz w:val="20"/>
+              </w:rPr>
+              <w:t>唔好</w:t>
+            </w:r>
+            <w:r>
+              <w:rPr>
+                <w:rFonts w:ascii="Calibri" w:hAnsi="Calibri" w:eastAsia="Microsoft JhengHei"/>
+                <w:sz w:val="20"/>
+              </w:rPr>
+              <w:t xml:space="preserve"> 引 n=1 個案。生育計劃交 Medical 反應式交流。</w:t>
+            </w:r>
+          </w:p>
+        </w:tc>
+      </w:tr>
+      <w:tr>
+        <w:tc>
+          <w:tcPr>
+            <w:tcW w:type="dxa" w:w="4824"/>
+          </w:tcPr>
+          <w:p>
+            <w:r>
+              <w:rPr>
+                <w:rFonts w:ascii="Calibri" w:hAnsi="Calibri" w:eastAsia="Microsoft JhengHei"/>
+                <w:sz w:val="20"/>
+              </w:rPr>
+              <w:t>抑鬱／甲狀腺／肝？</w:t>
+            </w:r>
+          </w:p>
+        </w:tc>
+        <w:tc>
+          <w:tcPr>
+            <w:tcW w:type="dxa" w:w="4824"/>
+          </w:tcPr>
+          <w:p>
+            <w:r>
+              <w:rPr>
+                <w:rFonts w:ascii="Calibri" w:hAnsi="Calibri" w:eastAsia="Microsoft JhengHei"/>
+                <w:sz w:val="20"/>
+              </w:rPr>
+              <w:t>嚴重精神科史、未控制甲狀腺 = 禁忌。呢頁 safety：肝酶係 IFN 特徵（GGT 16% vs 2%）。要監測 LFT、情緒。</w:t>
+            </w:r>
+          </w:p>
+        </w:tc>
+      </w:tr>
+      <w:tr>
+        <w:tc>
+          <w:tcPr>
+            <w:tcW w:type="dxa" w:w="4824"/>
+          </w:tcPr>
+          <w:p>
+            <w:r>
+              <w:rPr>
+                <w:rFonts w:ascii="Calibri" w:hAnsi="Calibri" w:eastAsia="Microsoft JhengHei"/>
+                <w:sz w:val="20"/>
+              </w:rPr>
+              <w:t>亞洲人數據？脫髮？</w:t>
+            </w:r>
+          </w:p>
+        </w:tc>
+        <w:tc>
+          <w:tcPr>
+            <w:tcW w:type="dxa" w:w="4824"/>
+          </w:tcPr>
+          <w:p>
+            <w:r>
+              <w:rPr>
+                <w:rFonts w:ascii="Calibri" w:hAnsi="Calibri" w:eastAsia="Microsoft JhengHei"/>
+                <w:sz w:val="20"/>
+              </w:rPr>
+              <w:t xml:space="preserve">日本 Ph2 n=29、起始 100 µg 係 PI-like；脫髮 55.2% </w:t>
+            </w:r>
+            <w:r>
+              <w:rPr>
+                <w:rFonts w:ascii="Calibri" w:hAnsi="Calibri" w:eastAsia="Microsoft JhengHei"/>
+                <w:b/>
+                <w:sz w:val="20"/>
+              </w:rPr>
+              <w:t>唔好</w:t>
+            </w:r>
+            <w:r>
+              <w:rPr>
+                <w:rFonts w:ascii="Calibri" w:hAnsi="Calibri" w:eastAsia="Microsoft JhengHei"/>
+                <w:sz w:val="20"/>
+              </w:rPr>
+              <w:t xml:space="preserve"> 當作 brochure 第 9 頁。PI 脫髮約 6–7%。中國 Ph2（Jin）= </w:t>
+            </w:r>
+            <w:r>
+              <w:rPr>
+                <w:rFonts w:ascii="Calibri" w:hAnsi="Calibri" w:eastAsia="Microsoft JhengHei"/>
+                <w:b/>
+                <w:sz w:val="20"/>
+              </w:rPr>
+              <w:t>protocol，冇結果</w:t>
+            </w:r>
+            <w:r>
+              <w:rPr>
+                <w:rFonts w:ascii="Calibri" w:hAnsi="Calibri" w:eastAsia="Microsoft JhengHei"/>
+                <w:sz w:val="20"/>
+              </w:rPr>
+              <w:t xml:space="preserve"> 。</w:t>
+            </w:r>
+          </w:p>
+        </w:tc>
+      </w:tr>
+      <w:tr>
+        <w:tc>
+          <w:tcPr>
+            <w:tcW w:type="dxa" w:w="4824"/>
+          </w:tcPr>
+          <w:p>
+            <w:r>
+              <w:rPr>
+                <w:rFonts w:ascii="Calibri" w:hAnsi="Calibri" w:eastAsia="Microsoft JhengHei"/>
+                <w:sz w:val="20"/>
+              </w:rPr>
+              <w:t>低危、淨放血得唔得？</w:t>
+            </w:r>
+          </w:p>
+        </w:tc>
+        <w:tc>
+          <w:tcPr>
+            <w:tcW w:type="dxa" w:w="4824"/>
+          </w:tcPr>
+          <w:p>
+            <w:r>
+              <w:rPr>
+                <w:rFonts w:ascii="Calibri" w:hAnsi="Calibri" w:eastAsia="Microsoft JhengHei"/>
+                <w:sz w:val="20"/>
+              </w:rPr>
+              <w:t xml:space="preserve">可講疾病目標同放血負擔。Low-PV </w:t>
+            </w:r>
+            <w:r>
+              <w:rPr>
+                <w:rFonts w:ascii="Calibri" w:hAnsi="Calibri" w:eastAsia="Microsoft JhengHei"/>
+                <w:b/>
+                <w:sz w:val="20"/>
+              </w:rPr>
+              <w:t>固定 100 µg</w:t>
+            </w:r>
+            <w:r>
+              <w:rPr>
+                <w:rFonts w:ascii="Calibri" w:hAnsi="Calibri" w:eastAsia="Microsoft JhengHei"/>
+                <w:sz w:val="20"/>
+              </w:rPr>
+              <w:t xml:space="preserve"> ≠ PI 滴定—— </w:t>
+            </w:r>
+            <w:r>
+              <w:rPr>
+                <w:rFonts w:ascii="Calibri" w:hAnsi="Calibri" w:eastAsia="Microsoft JhengHei"/>
+                <w:b/>
+                <w:sz w:val="20"/>
+              </w:rPr>
+              <w:t>除非 Medical 今日批准</w:t>
+            </w:r>
+            <w:r>
+              <w:rPr>
+                <w:rFonts w:ascii="Calibri" w:hAnsi="Calibri" w:eastAsia="Microsoft JhengHei"/>
+                <w:sz w:val="20"/>
+              </w:rPr>
+              <w:t xml:space="preserve"> ，否則唔好當 core。</w:t>
+            </w:r>
+          </w:p>
+        </w:tc>
+      </w:tr>
+      <w:tr>
+        <w:tc>
+          <w:tcPr>
+            <w:tcW w:type="dxa" w:w="4824"/>
+          </w:tcPr>
+          <w:p>
+            <w:r>
+              <w:rPr>
+                <w:rFonts w:ascii="Calibri" w:hAnsi="Calibri" w:eastAsia="Microsoft JhengHei"/>
+                <w:sz w:val="20"/>
+              </w:rPr>
+              <w:t>ET／MF／移植／細胞治療？</w:t>
+            </w:r>
+          </w:p>
+        </w:tc>
+        <w:tc>
+          <w:tcPr>
+            <w:tcW w:type="dxa" w:w="4824"/>
+          </w:tcPr>
+          <w:p>
+            <w:r>
+              <w:rPr>
+                <w:rFonts w:ascii="Calibri" w:hAnsi="Calibri" w:eastAsia="Microsoft JhengHei"/>
+                <w:sz w:val="20"/>
+              </w:rPr>
+              <w:t xml:space="preserve">中心會見到呢啲病人。 </w:t>
+            </w:r>
+            <w:r>
+              <w:rPr>
+                <w:rFonts w:ascii="Calibri" w:hAnsi="Calibri" w:eastAsia="Microsoft JhengHei"/>
+                <w:b/>
+                <w:sz w:val="20"/>
+              </w:rPr>
+              <w:t>唔喺香港適應證。</w:t>
+            </w:r>
+            <w:r>
+              <w:rPr>
+                <w:rFonts w:ascii="Calibri" w:hAnsi="Calibri" w:eastAsia="Microsoft JhengHei"/>
+                <w:sz w:val="20"/>
+              </w:rPr>
+              <w:t xml:space="preserve"> Reactive、引 PI、唔留物料、Veeva。</w:t>
+            </w:r>
+          </w:p>
+        </w:tc>
+      </w:tr>
+    </w:tbl>
+    <w:p>
       <w:r>
         <w:rPr>
           <w:rFonts w:ascii="Calibri" w:hAnsi="Calibri" w:eastAsia="Microsoft JhengHei"/>
@@ -4609,21 +5599,216 @@
     </w:p>
     <w:p>
       <w:pPr>
-        <w:spacing w:after="120" w:line="276" w:lineRule="auto"/>
+        <w:pStyle w:val="Heading3"/>
       </w:pPr>
       <w:r>
         <w:rPr>
           <w:rFonts w:ascii="Calibri" w:hAnsi="Calibri" w:eastAsia="Microsoft JhengHei"/>
-          <w:sz w:val="22"/>
-        </w:rPr>
-      </w:r>
-      <w:r>
-        <w:rPr>
-          <w:rFonts w:ascii="Calibri" w:hAnsi="Calibri" w:eastAsia="Microsoft JhengHei"/>
-          <w:sz w:val="22"/>
-        </w:rPr>
-        <w:t>任何 off-label 科學問題我會經 Medical 記錄，亦都唔會留下 ET／MF 物料。」</w:t>
-      </w:r>
+          <w:sz w:val="24"/>
+        </w:rPr>
+        <w:t>C. 可能問、但唔好自己先開</w:t>
+      </w:r>
+      <w:r>
+        <w:rPr>
+          <w:rFonts w:ascii="Calibri" w:hAnsi="Calibri" w:eastAsia="Microsoft JhengHei"/>
+          <w:sz w:val="24"/>
+        </w:rPr>
+      </w:r>
+    </w:p>
+    <w:tbl>
+      <w:tblPr>
+        <w:tblStyle w:val="TableGrid"/>
+        <w:tblW w:type="auto" w:w="0"/>
+        <w:tblLook w:firstColumn="1" w:firstRow="1" w:lastColumn="0" w:lastRow="0" w:noHBand="0" w:noVBand="1" w:val="04A0"/>
+      </w:tblPr>
+      <w:tblGrid>
+        <w:gridCol w:w="4824"/>
+        <w:gridCol w:w="4824"/>
+      </w:tblGrid>
+      <w:tr>
+        <w:tc>
+          <w:tcPr>
+            <w:tcW w:type="dxa" w:w="4824"/>
+          </w:tcPr>
+          <w:p>
+            <w:r>
+              <w:rPr>
+                <w:rFonts w:ascii="Calibri" w:hAnsi="Calibri" w:eastAsia="Microsoft JhengHei"/>
+                <w:b/>
+                <w:sz w:val="20"/>
+              </w:rPr>
+              <w:t>題</w:t>
+            </w:r>
+          </w:p>
+        </w:tc>
+        <w:tc>
+          <w:tcPr>
+            <w:tcW w:type="dxa" w:w="4824"/>
+          </w:tcPr>
+          <w:p>
+            <w:r>
+              <w:rPr>
+                <w:rFonts w:ascii="Calibri" w:hAnsi="Calibri" w:eastAsia="Microsoft JhengHei"/>
+                <w:b/>
+                <w:sz w:val="20"/>
+              </w:rPr>
+              <w:t>點處理</w:t>
+            </w:r>
+          </w:p>
+        </w:tc>
+      </w:tr>
+      <w:tr>
+        <w:tc>
+          <w:tcPr>
+            <w:tcW w:type="dxa" w:w="4824"/>
+          </w:tcPr>
+          <w:p>
+            <w:r>
+              <w:rPr>
+                <w:rFonts w:ascii="Calibri" w:hAnsi="Calibri" w:eastAsia="Microsoft JhengHei"/>
+                <w:sz w:val="20"/>
+              </w:rPr>
+              <w:t>香港有幾多病人用緊／邊位 KOL 用</w:t>
+            </w:r>
+          </w:p>
+        </w:tc>
+        <w:tc>
+          <w:tcPr>
+            <w:tcW w:type="dxa" w:w="4824"/>
+          </w:tcPr>
+          <w:p>
+            <w:r>
+              <w:rPr>
+                <w:rFonts w:ascii="Calibri" w:hAnsi="Calibri" w:eastAsia="Microsoft JhengHei"/>
+                <w:sz w:val="20"/>
+              </w:rPr>
+              <w:t>唔報內部數字、唔點名。可以講適應證同 PSP 路徑。</w:t>
+            </w:r>
+          </w:p>
+        </w:tc>
+      </w:tr>
+      <w:tr>
+        <w:tc>
+          <w:tcPr>
+            <w:tcW w:type="dxa" w:w="4824"/>
+          </w:tcPr>
+          <w:p>
+            <w:r>
+              <w:rPr>
+                <w:rFonts w:ascii="Calibri" w:hAnsi="Calibri" w:eastAsia="Microsoft JhengHei"/>
+                <w:sz w:val="20"/>
+              </w:rPr>
+              <w:t>有冇香港 trial／PARADIGM</w:t>
+            </w:r>
+          </w:p>
+        </w:tc>
+        <w:tc>
+          <w:tcPr>
+            <w:tcW w:type="dxa" w:w="4824"/>
+          </w:tcPr>
+          <w:p>
+            <w:r>
+              <w:rPr>
+                <w:rFonts w:ascii="Calibri" w:hAnsi="Calibri" w:eastAsia="Microsoft JhengHei"/>
+                <w:sz w:val="20"/>
+              </w:rPr>
+              <w:t>唔好即場承諾 site。交 Medical／CPM。</w:t>
+            </w:r>
+          </w:p>
+        </w:tc>
+      </w:tr>
+      <w:tr>
+        <w:tc>
+          <w:tcPr>
+            <w:tcW w:type="dxa" w:w="4824"/>
+          </w:tcPr>
+          <w:p>
+            <w:r>
+              <w:rPr>
+                <w:rFonts w:ascii="Calibri" w:hAnsi="Calibri" w:eastAsia="Microsoft JhengHei"/>
+                <w:sz w:val="20"/>
+              </w:rPr>
+              <w:t>84.3%／圖 12 個月 62%</w:t>
+            </w:r>
+          </w:p>
+        </w:tc>
+        <w:tc>
+          <w:tcPr>
+            <w:tcW w:type="dxa" w:w="4824"/>
+          </w:tcPr>
+          <w:p>
+            <w:r>
+              <w:rPr>
+                <w:rFonts w:ascii="Calibri" w:hAnsi="Calibri" w:eastAsia="Microsoft JhengHei"/>
+                <w:sz w:val="20"/>
+              </w:rPr>
+              <w:t>見上面：ever-CHR vs ITT 43.1% vs 圖。</w:t>
+            </w:r>
+          </w:p>
+        </w:tc>
+      </w:tr>
+      <w:tr>
+        <w:tc>
+          <w:tcPr>
+            <w:tcW w:type="dxa" w:w="4824"/>
+          </w:tcPr>
+          <w:p>
+            <w:r>
+              <w:rPr>
+                <w:rFonts w:ascii="Calibri" w:hAnsi="Calibri" w:eastAsia="Microsoft JhengHei"/>
+                <w:sz w:val="20"/>
+              </w:rPr>
+              <w:t>預防白血病／長命啲</w:t>
+            </w:r>
+          </w:p>
+        </w:tc>
+        <w:tc>
+          <w:tcPr>
+            <w:tcW w:type="dxa" w:w="4824"/>
+          </w:tcPr>
+          <w:p>
+            <w:r>
+              <w:rPr>
+                <w:rFonts w:ascii="Calibri" w:hAnsi="Calibri" w:eastAsia="Microsoft JhengHei"/>
+                <w:sz w:val="20"/>
+              </w:rPr>
+              <w:t>EFS ≠ OS。唔好比。</w:t>
+            </w:r>
+          </w:p>
+        </w:tc>
+      </w:tr>
+      <w:tr>
+        <w:tc>
+          <w:tcPr>
+            <w:tcW w:type="dxa" w:w="4824"/>
+          </w:tcPr>
+          <w:p>
+            <w:r>
+              <w:rPr>
+                <w:rFonts w:ascii="Calibri" w:hAnsi="Calibri" w:eastAsia="Microsoft JhengHei"/>
+                <w:sz w:val="20"/>
+              </w:rPr>
+              <w:t>內地 ropeg 平好多</w:t>
+            </w:r>
+          </w:p>
+        </w:tc>
+        <w:tc>
+          <w:tcPr>
+            <w:tcW w:type="dxa" w:w="4824"/>
+          </w:tcPr>
+          <w:p>
+            <w:r>
+              <w:rPr>
+                <w:rFonts w:ascii="Calibri" w:hAnsi="Calibri" w:eastAsia="Microsoft JhengHei"/>
+                <w:sz w:val="20"/>
+              </w:rPr>
+              <w:t>冇 H2H；唔好比 potency；香港跟香港註冊產品。</w:t>
+            </w:r>
+          </w:p>
+        </w:tc>
+      </w:tr>
+    </w:tbl>
+    <w:p>
       <w:r>
         <w:rPr>
           <w:rFonts w:ascii="Calibri" w:hAnsi="Calibri" w:eastAsia="Microsoft JhengHei"/>
@@ -4632,9 +5817,6 @@
       </w:r>
     </w:p>
     <w:p>
-      <w:pPr>
-        <w:spacing w:after="120" w:line="276" w:lineRule="auto"/>
-      </w:pPr>
       <w:r>
         <w:rPr>
           <w:rFonts w:ascii="Calibri" w:hAnsi="Calibri" w:eastAsia="Microsoft JhengHei"/>
@@ -4647,149 +5829,14 @@
           <w:b/>
           <w:sz w:val="22"/>
         </w:rPr>
-        <w:t>臨走內部記錄：</w:t>
-      </w:r>
-      <w:r>
-        <w:rPr>
-          <w:rFonts w:ascii="Calibri" w:hAnsi="Calibri" w:eastAsia="Microsoft JhengHei"/>
-          <w:sz w:val="22"/>
-        </w:rPr>
-      </w:r>
-      <w:r>
-        <w:rPr>
-          <w:rFonts w:ascii="Calibri" w:hAnsi="Calibri" w:eastAsia="Microsoft JhengHei"/>
-          <w:sz w:val="22"/>
-        </w:rPr>
-      </w:r>
-    </w:p>
-    <w:p>
-      <w:pPr>
-        <w:pStyle w:val="ListNumber"/>
-        <w:spacing w:line="276" w:lineRule="auto" w:after="120"/>
-        <w:ind w:left="720"/>
-      </w:pPr>
-      <w:r>
-        <w:rPr>
-          <w:rFonts w:ascii="Calibri" w:hAnsi="Calibri" w:eastAsia="Microsoft JhengHei"/>
-          <w:sz w:val="22"/>
-        </w:rPr>
-      </w:r>
-      <w:r>
-        <w:rPr>
-          <w:rFonts w:ascii="Calibri" w:hAnsi="Calibri" w:eastAsia="Microsoft JhengHei"/>
-          <w:sz w:val="22"/>
-        </w:rPr>
-        <w:t xml:space="preserve">會唔會指出第一位病人？會／唔會／之後 </w:t>
-      </w:r>
-      <w:r>
-        <w:rPr>
-          <w:rFonts w:ascii="Calibri" w:hAnsi="Calibri" w:eastAsia="Microsoft JhengHei"/>
-          <w:sz w:val="22"/>
-        </w:rPr>
-      </w:r>
-    </w:p>
-    <w:p>
-      <w:pPr>
-        <w:pStyle w:val="ListNumber"/>
-        <w:spacing w:line="276" w:lineRule="auto" w:after="120"/>
-        <w:ind w:left="720"/>
-      </w:pPr>
-      <w:r>
-        <w:rPr>
-          <w:rFonts w:ascii="Calibri" w:hAnsi="Calibri" w:eastAsia="Microsoft JhengHei"/>
-          <w:sz w:val="22"/>
-        </w:rPr>
-      </w:r>
-      <w:r>
-        <w:rPr>
-          <w:rFonts w:ascii="Calibri" w:hAnsi="Calibri" w:eastAsia="Microsoft JhengHei"/>
-          <w:sz w:val="22"/>
-        </w:rPr>
-        <w:t xml:space="preserve">障礙：療效／安全／價錢／脾／習慣／其他 </w:t>
-      </w:r>
-      <w:r>
-        <w:rPr>
-          <w:rFonts w:ascii="Calibri" w:hAnsi="Calibri" w:eastAsia="Microsoft JhengHei"/>
-          <w:sz w:val="22"/>
-        </w:rPr>
-      </w:r>
-    </w:p>
-    <w:p>
-      <w:pPr>
-        <w:pStyle w:val="ListNumber"/>
-        <w:spacing w:line="276" w:lineRule="auto" w:after="120"/>
-        <w:ind w:left="720"/>
-      </w:pPr>
-      <w:r>
-        <w:rPr>
-          <w:rFonts w:ascii="Calibri" w:hAnsi="Calibri" w:eastAsia="Microsoft JhengHei"/>
-          <w:sz w:val="22"/>
-        </w:rPr>
-      </w:r>
-      <w:r>
-        <w:rPr>
-          <w:rFonts w:ascii="Calibri" w:hAnsi="Calibri" w:eastAsia="Microsoft JhengHei"/>
-          <w:sz w:val="22"/>
-        </w:rPr>
-        <w:t xml:space="preserve">有興趣嘅 PSP：Private Sector／Base Case／都唔要 </w:t>
-      </w:r>
-      <w:r>
-        <w:rPr>
-          <w:rFonts w:ascii="Calibri" w:hAnsi="Calibri" w:eastAsia="Microsoft JhengHei"/>
-          <w:sz w:val="22"/>
-        </w:rPr>
-      </w:r>
-    </w:p>
-    <w:p>
-      <w:pPr>
-        <w:pStyle w:val="ListNumber"/>
-        <w:spacing w:line="276" w:lineRule="auto" w:after="120"/>
-        <w:ind w:left="720"/>
-      </w:pPr>
-      <w:r>
-        <w:rPr>
-          <w:rFonts w:ascii="Calibri" w:hAnsi="Calibri" w:eastAsia="Microsoft JhengHei"/>
-          <w:sz w:val="22"/>
-        </w:rPr>
-      </w:r>
-      <w:r>
-        <w:rPr>
-          <w:rFonts w:ascii="Calibri" w:hAnsi="Calibri" w:eastAsia="Microsoft JhengHei"/>
-          <w:sz w:val="22"/>
-        </w:rPr>
-        <w:t xml:space="preserve">有冇問 off-label？有／冇 — Veeva </w:t>
-      </w:r>
-      <w:r>
-        <w:rPr>
-          <w:rFonts w:ascii="Calibri" w:hAnsi="Calibri" w:eastAsia="Microsoft JhengHei"/>
-          <w:sz w:val="22"/>
-        </w:rPr>
-      </w:r>
-    </w:p>
-    <w:p>
-      <w:pPr>
-        <w:pStyle w:val="ListNumber"/>
-        <w:spacing w:line="276" w:lineRule="auto" w:after="120"/>
-        <w:ind w:left="720"/>
-      </w:pPr>
-      <w:r>
-        <w:rPr>
-          <w:rFonts w:ascii="Calibri" w:hAnsi="Calibri" w:eastAsia="Microsoft JhengHei"/>
-          <w:sz w:val="22"/>
-        </w:rPr>
-      </w:r>
-      <w:r>
-        <w:rPr>
-          <w:rFonts w:ascii="Calibri" w:hAnsi="Calibri" w:eastAsia="Microsoft JhengHei"/>
-          <w:sz w:val="22"/>
-        </w:rPr>
-        <w:t xml:space="preserve">跟進負責人 + 日期 </w:t>
-      </w:r>
-      <w:r>
-        <w:rPr>
-          <w:rFonts w:ascii="Calibri" w:hAnsi="Calibri" w:eastAsia="Microsoft JhengHei"/>
-          <w:sz w:val="22"/>
-        </w:rPr>
+        <w:t>今日優先預演順序：</w:t>
+      </w:r>
+      <w:r>
+        <w:rPr>
+          <w:rFonts w:ascii="Calibri" w:hAnsi="Calibri" w:eastAsia="Microsoft JhengHei"/>
+          <w:sz w:val="22"/>
+        </w:rPr>
+        <w:t xml:space="preserve"> 貴 → Pegasys／switch 50 µg → HIDAT 100 µg → 脾／適應證 → 醫管局／PSP 2026 → 自己打／雪櫃 → 懷孕 → ET／MF（收口）。</w:t>
       </w:r>
       <w:r>
         <w:rPr>
@@ -4803,7 +5850,6 @@
         <w:pBdr>
           <w:bottom w:val="single" w:sz="6" w:space="1" w:color="auto"/>
         </w:pBdr>
-        <w:spacing w:after="120" w:line="276" w:lineRule="auto"/>
       </w:pPr>
       <w:r>
         <w:rPr>
@@ -4815,7 +5861,294 @@
     <w:p>
       <w:pPr>
         <w:pStyle w:val="Heading2"/>
-        <w:spacing w:after="120" w:line="276" w:lineRule="auto"/>
+      </w:pPr>
+      <w:r>
+        <w:rPr>
+          <w:rFonts w:ascii="Calibri" w:hAnsi="Calibri" w:eastAsia="Microsoft JhengHei"/>
+          <w:sz w:val="28"/>
+        </w:rPr>
+        <w:t>收結（2 分鐘）</w:t>
+      </w:r>
+      <w:r>
+        <w:rPr>
+          <w:rFonts w:ascii="Calibri" w:hAnsi="Calibri" w:eastAsia="Microsoft JhengHei"/>
+          <w:sz w:val="28"/>
+        </w:rPr>
+      </w:r>
+    </w:p>
+    <w:p>
+      <w:r>
+        <w:rPr>
+          <w:rFonts w:ascii="Calibri" w:hAnsi="Calibri" w:eastAsia="Microsoft JhengHei"/>
+          <w:sz w:val="22"/>
+        </w:rPr>
+      </w:r>
+      <w:r>
+        <w:rPr>
+          <w:rFonts w:ascii="Calibri" w:hAnsi="Calibri" w:eastAsia="Microsoft JhengHei"/>
+          <w:sz w:val="22"/>
+        </w:rPr>
+        <w:t xml:space="preserve">「如果您試一位病人，標籤合適嘅係 </w:t>
+      </w:r>
+      <w:r>
+        <w:rPr>
+          <w:rFonts w:ascii="Calibri" w:hAnsi="Calibri" w:eastAsia="Microsoft JhengHei"/>
+          <w:b/>
+          <w:sz w:val="22"/>
+        </w:rPr>
+        <w:t>成年 PV、無症狀性脾腫大</w:t>
+      </w:r>
+      <w:r>
+        <w:rPr>
+          <w:rFonts w:ascii="Calibri" w:hAnsi="Calibri" w:eastAsia="Microsoft JhengHei"/>
+          <w:sz w:val="22"/>
+        </w:rPr>
+        <w:t xml:space="preserve">，而且您想要疾病導向嘅細胞減少，而唔係得一年 hematocrit 快照——好多時係 </w:t>
+      </w:r>
+      <w:r>
+        <w:rPr>
+          <w:rFonts w:ascii="Calibri" w:hAnsi="Calibri" w:eastAsia="Microsoft JhengHei"/>
+          <w:b/>
+          <w:sz w:val="22"/>
+        </w:rPr>
+        <w:t>HU 不耐受、放血負擔重、或者時間視野較長</w:t>
+      </w:r>
+      <w:r>
+        <w:rPr>
+          <w:rFonts w:ascii="Calibri" w:hAnsi="Calibri" w:eastAsia="Microsoft JhengHei"/>
+          <w:sz w:val="22"/>
+        </w:rPr>
+        <w:t>。</w:t>
+      </w:r>
+      <w:r>
+        <w:rPr>
+          <w:rFonts w:ascii="Calibri" w:hAnsi="Calibri" w:eastAsia="Microsoft JhengHei"/>
+          <w:sz w:val="22"/>
+        </w:rPr>
+      </w:r>
+    </w:p>
+    <w:p>
+      <w:r>
+        <w:rPr>
+          <w:rFonts w:ascii="Calibri" w:hAnsi="Calibri" w:eastAsia="Microsoft JhengHei"/>
+          <w:sz w:val="22"/>
+        </w:rPr>
+      </w:r>
+      <w:r>
+        <w:rPr>
+          <w:rFonts w:ascii="Calibri" w:hAnsi="Calibri" w:eastAsia="Microsoft JhengHei"/>
+          <w:sz w:val="22"/>
+        </w:rPr>
+        <w:t>您需要我哋邊樣：護士注射培訓、PSP 文件，定係 Medical 跟進某個 protocol 問題？</w:t>
+      </w:r>
+      <w:r>
+        <w:rPr>
+          <w:rFonts w:ascii="Calibri" w:hAnsi="Calibri" w:eastAsia="Microsoft JhengHei"/>
+          <w:sz w:val="22"/>
+        </w:rPr>
+      </w:r>
+    </w:p>
+    <w:p>
+      <w:r>
+        <w:rPr>
+          <w:rFonts w:ascii="Calibri" w:hAnsi="Calibri" w:eastAsia="Microsoft JhengHei"/>
+          <w:sz w:val="22"/>
+        </w:rPr>
+      </w:r>
+      <w:r>
+        <w:rPr>
+          <w:rFonts w:ascii="Calibri" w:hAnsi="Calibri" w:eastAsia="Microsoft JhengHei"/>
+          <w:sz w:val="22"/>
+        </w:rPr>
+        <w:t>任何 off-label 科學問題我會經 Medical 記錄，亦都唔會留下 ET／MF 物料。」</w:t>
+      </w:r>
+      <w:r>
+        <w:rPr>
+          <w:rFonts w:ascii="Calibri" w:hAnsi="Calibri" w:eastAsia="Microsoft JhengHei"/>
+          <w:sz w:val="22"/>
+        </w:rPr>
+      </w:r>
+    </w:p>
+    <w:p>
+      <w:r>
+        <w:rPr>
+          <w:rFonts w:ascii="Calibri" w:hAnsi="Calibri" w:eastAsia="Microsoft JhengHei"/>
+          <w:sz w:val="22"/>
+        </w:rPr>
+      </w:r>
+      <w:r>
+        <w:rPr>
+          <w:rFonts w:ascii="Calibri" w:hAnsi="Calibri" w:eastAsia="Microsoft JhengHei"/>
+          <w:b/>
+          <w:sz w:val="22"/>
+        </w:rPr>
+        <w:t>臨走內部記錄：</w:t>
+      </w:r>
+      <w:r>
+        <w:rPr>
+          <w:rFonts w:ascii="Calibri" w:hAnsi="Calibri" w:eastAsia="Microsoft JhengHei"/>
+          <w:sz w:val="22"/>
+        </w:rPr>
+      </w:r>
+      <w:r>
+        <w:rPr>
+          <w:rFonts w:ascii="Calibri" w:hAnsi="Calibri" w:eastAsia="Microsoft JhengHei"/>
+          <w:sz w:val="22"/>
+        </w:rPr>
+      </w:r>
+    </w:p>
+    <w:p>
+      <w:pPr>
+        <w:pStyle w:val="ListNumber"/>
+        <w:spacing w:line="240" w:lineRule="auto"/>
+        <w:ind w:left="720"/>
+      </w:pPr>
+      <w:r>
+        <w:rPr>
+          <w:rFonts w:ascii="Calibri" w:hAnsi="Calibri" w:eastAsia="Microsoft JhengHei"/>
+          <w:sz w:val="22"/>
+        </w:rPr>
+      </w:r>
+      <w:r>
+        <w:rPr>
+          <w:rFonts w:ascii="Calibri" w:hAnsi="Calibri" w:eastAsia="Microsoft JhengHei"/>
+          <w:sz w:val="22"/>
+        </w:rPr>
+        <w:t xml:space="preserve">會唔會指出第一位病人？會／唔會／之後 </w:t>
+      </w:r>
+      <w:r>
+        <w:rPr>
+          <w:rFonts w:ascii="Calibri" w:hAnsi="Calibri" w:eastAsia="Microsoft JhengHei"/>
+          <w:sz w:val="22"/>
+        </w:rPr>
+      </w:r>
+    </w:p>
+    <w:p>
+      <w:pPr>
+        <w:pStyle w:val="ListNumber"/>
+        <w:spacing w:line="240" w:lineRule="auto"/>
+        <w:ind w:left="720"/>
+      </w:pPr>
+      <w:r>
+        <w:rPr>
+          <w:rFonts w:ascii="Calibri" w:hAnsi="Calibri" w:eastAsia="Microsoft JhengHei"/>
+          <w:sz w:val="22"/>
+        </w:rPr>
+      </w:r>
+      <w:r>
+        <w:rPr>
+          <w:rFonts w:ascii="Calibri" w:hAnsi="Calibri" w:eastAsia="Microsoft JhengHei"/>
+          <w:sz w:val="22"/>
+        </w:rPr>
+        <w:t xml:space="preserve">障礙：療效／安全／價錢／脾／習慣／其他 </w:t>
+      </w:r>
+      <w:r>
+        <w:rPr>
+          <w:rFonts w:ascii="Calibri" w:hAnsi="Calibri" w:eastAsia="Microsoft JhengHei"/>
+          <w:sz w:val="22"/>
+        </w:rPr>
+      </w:r>
+    </w:p>
+    <w:p>
+      <w:pPr>
+        <w:pStyle w:val="ListNumber"/>
+        <w:spacing w:line="240" w:lineRule="auto"/>
+        <w:ind w:left="720"/>
+      </w:pPr>
+      <w:r>
+        <w:rPr>
+          <w:rFonts w:ascii="Calibri" w:hAnsi="Calibri" w:eastAsia="Microsoft JhengHei"/>
+          <w:sz w:val="22"/>
+        </w:rPr>
+      </w:r>
+      <w:r>
+        <w:rPr>
+          <w:rFonts w:ascii="Calibri" w:hAnsi="Calibri" w:eastAsia="Microsoft JhengHei"/>
+          <w:sz w:val="22"/>
+        </w:rPr>
+        <w:t xml:space="preserve">有興趣嘅 PSP：Private Sector／Base Case／都唔要 </w:t>
+      </w:r>
+      <w:r>
+        <w:rPr>
+          <w:rFonts w:ascii="Calibri" w:hAnsi="Calibri" w:eastAsia="Microsoft JhengHei"/>
+          <w:sz w:val="22"/>
+        </w:rPr>
+      </w:r>
+    </w:p>
+    <w:p>
+      <w:pPr>
+        <w:pStyle w:val="ListNumber"/>
+        <w:spacing w:line="240" w:lineRule="auto"/>
+        <w:ind w:left="720"/>
+      </w:pPr>
+      <w:r>
+        <w:rPr>
+          <w:rFonts w:ascii="Calibri" w:hAnsi="Calibri" w:eastAsia="Microsoft JhengHei"/>
+          <w:sz w:val="22"/>
+        </w:rPr>
+      </w:r>
+      <w:r>
+        <w:rPr>
+          <w:rFonts w:ascii="Calibri" w:hAnsi="Calibri" w:eastAsia="Microsoft JhengHei"/>
+          <w:sz w:val="22"/>
+        </w:rPr>
+        <w:t xml:space="preserve">有冇問 off-label？有／冇 — Veeva </w:t>
+      </w:r>
+      <w:r>
+        <w:rPr>
+          <w:rFonts w:ascii="Calibri" w:hAnsi="Calibri" w:eastAsia="Microsoft JhengHei"/>
+          <w:sz w:val="22"/>
+        </w:rPr>
+      </w:r>
+    </w:p>
+    <w:p>
+      <w:pPr>
+        <w:pStyle w:val="ListNumber"/>
+        <w:spacing w:line="240" w:lineRule="auto"/>
+        <w:ind w:left="720"/>
+      </w:pPr>
+      <w:r>
+        <w:rPr>
+          <w:rFonts w:ascii="Calibri" w:hAnsi="Calibri" w:eastAsia="Microsoft JhengHei"/>
+          <w:sz w:val="22"/>
+        </w:rPr>
+      </w:r>
+      <w:r>
+        <w:rPr>
+          <w:rFonts w:ascii="Calibri" w:hAnsi="Calibri" w:eastAsia="Microsoft JhengHei"/>
+          <w:sz w:val="22"/>
+        </w:rPr>
+        <w:t xml:space="preserve">跟進負責人 + 日期 </w:t>
+      </w:r>
+      <w:r>
+        <w:rPr>
+          <w:rFonts w:ascii="Calibri" w:hAnsi="Calibri" w:eastAsia="Microsoft JhengHei"/>
+          <w:sz w:val="22"/>
+        </w:rPr>
+      </w:r>
+      <w:r>
+        <w:rPr>
+          <w:rFonts w:ascii="Calibri" w:hAnsi="Calibri" w:eastAsia="Microsoft JhengHei"/>
+          <w:sz w:val="22"/>
+        </w:rPr>
+      </w:r>
+    </w:p>
+    <w:p>
+      <w:pPr>
+        <w:pBdr>
+          <w:bottom w:val="single" w:sz="6" w:space="1" w:color="auto"/>
+        </w:pBdr>
+      </w:pPr>
+      <w:r>
+        <w:rPr>
+          <w:rFonts w:ascii="Calibri" w:hAnsi="Calibri" w:eastAsia="Microsoft JhengHei"/>
+          <w:sz w:val="22"/>
+        </w:rPr>
+      </w:r>
+    </w:p>
+    <w:p>
+      <w:pPr>
+        <w:pStyle w:val="Heading2"/>
       </w:pPr>
       <w:r>
         <w:rPr>
@@ -4840,7 +6173,7 @@
     <w:p>
       <w:pPr>
         <w:pStyle w:val="ListBullet"/>
-        <w:spacing w:line="276" w:lineRule="auto" w:after="120"/>
+        <w:spacing w:line="240" w:lineRule="auto"/>
         <w:ind w:left="720"/>
       </w:pPr>
       <w:r>
@@ -4866,7 +6199,7 @@
     <w:p>
       <w:pPr>
         <w:pStyle w:val="ListBullet"/>
-        <w:spacing w:line="276" w:lineRule="auto" w:after="120"/>
+        <w:spacing w:line="240" w:lineRule="auto"/>
         <w:ind w:left="720"/>
       </w:pPr>
       <w:r>
@@ -4892,7 +6225,7 @@
     <w:p>
       <w:pPr>
         <w:pStyle w:val="ListBullet"/>
-        <w:spacing w:line="276" w:lineRule="auto" w:after="120"/>
+        <w:spacing w:line="240" w:lineRule="auto"/>
         <w:ind w:left="720"/>
       </w:pPr>
       <w:r>
@@ -4918,7 +6251,7 @@
     <w:p>
       <w:pPr>
         <w:pStyle w:val="ListBullet"/>
-        <w:spacing w:line="276" w:lineRule="auto" w:after="120"/>
+        <w:spacing w:line="240" w:lineRule="auto"/>
         <w:ind w:left="720"/>
       </w:pPr>
       <w:r>
@@ -4974,7 +6307,7 @@
     <w:p>
       <w:pPr>
         <w:pStyle w:val="ListBullet"/>
-        <w:spacing w:line="276" w:lineRule="auto" w:after="120"/>
+        <w:spacing w:line="240" w:lineRule="auto"/>
         <w:ind w:left="720"/>
       </w:pPr>
       <w:r>
@@ -5006,7 +6339,6 @@
     <w:p>
       <w:pPr>
         <w:pStyle w:val="Heading2"/>
-        <w:spacing w:after="120" w:line="276" w:lineRule="auto"/>
       </w:pPr>
       <w:r>
         <w:rPr>
@@ -5023,9 +6355,6 @@
       </w:r>
     </w:p>
     <w:p>
-      <w:pPr>
-        <w:spacing w:after="120" w:line="276" w:lineRule="auto"/>
-      </w:pPr>
       <w:r>
         <w:rPr>
           <w:rFonts w:ascii="Calibri" w:hAnsi="Calibri" w:eastAsia="Microsoft JhengHei"/>
@@ -5064,7 +6393,6 @@
     <w:p>
       <w:pPr>
         <w:pStyle w:val="Heading2"/>
-        <w:spacing w:after="120" w:line="276" w:lineRule="auto"/>
       </w:pPr>
       <w:r>
         <w:rPr>
@@ -5081,9 +6409,6 @@
       </w:r>
     </w:p>
     <w:p>
-      <w:pPr>
-        <w:spacing w:after="120" w:line="276" w:lineRule="auto"/>
-      </w:pPr>
       <w:r>
         <w:rPr>
           <w:rFonts w:ascii="Calibri" w:hAnsi="Calibri" w:eastAsia="Microsoft JhengHei"/>
@@ -5122,7 +6447,6 @@
     <w:p>
       <w:pPr>
         <w:pStyle w:val="Heading2"/>
-        <w:spacing w:after="120" w:line="276" w:lineRule="auto"/>
       </w:pPr>
       <w:r>
         <w:rPr>
@@ -5147,7 +6471,7 @@
     <w:p>
       <w:pPr>
         <w:pStyle w:val="ListNumber"/>
-        <w:spacing w:line="276" w:lineRule="auto" w:after="120"/>
+        <w:spacing w:line="240" w:lineRule="auto"/>
         <w:ind w:left="720"/>
       </w:pPr>
       <w:r>
@@ -5173,7 +6497,7 @@
     <w:p>
       <w:pPr>
         <w:pStyle w:val="ListNumber"/>
-        <w:spacing w:line="276" w:lineRule="auto" w:after="120"/>
+        <w:spacing w:line="240" w:lineRule="auto"/>
         <w:ind w:left="720"/>
       </w:pPr>
       <w:r>
@@ -5205,7 +6529,6 @@
     <w:p>
       <w:pPr>
         <w:pStyle w:val="Heading2"/>
-        <w:spacing w:after="120" w:line="276" w:lineRule="auto"/>
       </w:pPr>
       <w:r>
         <w:rPr>
@@ -5230,7 +6553,7 @@
     <w:p>
       <w:pPr>
         <w:pStyle w:val="ListBullet"/>
-        <w:spacing w:line="276" w:lineRule="auto" w:after="120"/>
+        <w:spacing w:line="240" w:lineRule="auto"/>
         <w:ind w:left="720"/>
       </w:pPr>
       <w:r>
@@ -5256,7 +6579,7 @@
     <w:p>
       <w:pPr>
         <w:pStyle w:val="ListBullet"/>
-        <w:spacing w:line="276" w:lineRule="auto" w:after="120"/>
+        <w:spacing w:line="240" w:lineRule="auto"/>
         <w:ind w:left="720"/>
       </w:pPr>
       <w:r>
@@ -5282,7 +6605,7 @@
     <w:p>
       <w:pPr>
         <w:pStyle w:val="ListBullet"/>
-        <w:spacing w:line="276" w:lineRule="auto" w:after="120"/>
+        <w:spacing w:line="240" w:lineRule="auto"/>
         <w:ind w:left="720"/>
       </w:pPr>
       <w:r>
@@ -5324,19 +6647,9 @@
       <w:pStyle w:val="Footer"/>
     </w:pPr>
     <w:r>
-      <w:rPr>
-        <w:rFonts w:ascii="Calibri" w:hAnsi="Calibri" w:eastAsia="Microsoft JhengHei"/>
-        <w:color w:val="5A6577"/>
-        <w:sz w:val="16"/>
-      </w:rPr>
-      <w:t xml:space="preserve">PharmaEssentia Asia (Hong Kong) Limited  ·  粵語講稿 DRAFT  ·  第 </w:t>
+      <w:t xml:space="preserve">PharmaEssentia Asia (Hong Kong) Limited  ·  第 </w:t>
     </w:r>
     <w:r>
-      <w:rPr>
-        <w:rFonts w:ascii="Calibri" w:hAnsi="Calibri" w:eastAsia="Microsoft JhengHei"/>
-        <w:color w:val="5A6577"/>
-        <w:sz w:val="16"/>
-      </w:rPr>
       <w:fldChar w:fldCharType="begin"/>
       <w:instrText xml:space="preserve"> PAGE </w:instrText>
       <w:fldChar w:fldCharType="end"/>
@@ -5358,7 +6671,7 @@
         <w:color w:val="E07A2F"/>
         <w:sz w:val="18"/>
       </w:rPr>
-      <w:t>DRAFT  |  梁教授一對一講稿（香港粵語）  |  含「一開波就話貴」  |  2026-08-26</w:t>
+      <w:t>DRAFT  |  梁教授一對一講稿（粵語）  |  含價錢閘 + 預計提問  |  2026-08-26</w:t>
     </w:r>
   </w:p>
 </w:hdr>
@@ -5728,8 +7041,7 @@
     <w:qFormat/>
     <w:rsid w:val="00FC693F"/>
     <w:rPr>
-      <w:rFonts w:ascii="Calibri" w:hAnsi="Calibri" w:eastAsia="Microsoft JhengHei"/>
-      <w:sz w:val="22"/>
+      <w:rFonts w:eastAsia="Microsoft JhengHei"/>
     </w:rPr>
   </w:style>
   <w:style w:type="paragraph" w:styleId="Header">

</xml_diff>